<commit_message>
Add regression pipeline, dashboard publish, outputs and docs updates
</commit_message>
<xml_diff>
--- a/docs/Energiafogyasztás alapú OEE elemzés.docx
+++ b/docs/Energiafogyasztás alapú OEE elemzés.docx
@@ -7054,6 +7054,2747 @@
       <w:proofErr w:type="spellEnd"/>
       <w:r>
         <w:t xml:space="preserve"> és gyors időablakos lekérdezésekhez.</w:t>
+      </w:r>
+    </w:p>
+    <w:p/>
+    <w:p>
+      <w:pPr>
+        <w:rPr>
+          <w:b/>
+          <w:bCs/>
+          <w:sz w:val="28"/>
+          <w:szCs w:val="28"/>
+        </w:rPr>
+      </w:pPr>
+      <w:r>
+        <w:rPr>
+          <w:b/>
+          <w:bCs/>
+          <w:sz w:val="28"/>
+          <w:szCs w:val="28"/>
+        </w:rPr>
+        <w:t>5. Regressziós modell és módszertani terv</w:t>
+      </w:r>
+    </w:p>
+    <w:p>
+      <w:r>
+        <w:t xml:space="preserve">A projekt következő lépése annak vizsgálata, hogy az OEE egyes komponensei milyen mértékben befolyásolják az energiaintenzitást. A feladatkiírás szerint ennek célja egy többváltozós regressziós modell felépítése, amelyben a célváltozó egy jó darabra jutó energiafogyasztás, a magyarázó változók pedig az </w:t>
+      </w:r>
+      <w:proofErr w:type="spellStart"/>
+      <w:r>
+        <w:t>Availability</w:t>
+      </w:r>
+      <w:proofErr w:type="spellEnd"/>
+      <w:r>
+        <w:t xml:space="preserve">, Performance és </w:t>
+      </w:r>
+      <w:proofErr w:type="spellStart"/>
+      <w:r>
+        <w:t>Quality</w:t>
+      </w:r>
+      <w:proofErr w:type="spellEnd"/>
+      <w:r>
+        <w:t xml:space="preserve"> komponensek. </w:t>
+      </w:r>
+      <w:r>
+        <w:t>A</w:t>
+      </w:r>
+      <w:r>
+        <w:t xml:space="preserve"> következő fejlesztési blokk a regresszióhoz előkészített adatréteg kialakítása és a megfelelő modellcsalád kiválasztása.</w:t>
+      </w:r>
+    </w:p>
+    <w:p/>
+    <w:p>
+      <w:pPr>
+        <w:rPr>
+          <w:b/>
+          <w:bCs/>
+          <w:color w:val="002060"/>
+          <w:sz w:val="24"/>
+          <w:szCs w:val="24"/>
+        </w:rPr>
+      </w:pPr>
+      <w:r>
+        <w:rPr>
+          <w:b/>
+          <w:bCs/>
+          <w:color w:val="002060"/>
+          <w:sz w:val="24"/>
+          <w:szCs w:val="24"/>
+        </w:rPr>
+        <w:t>5.1. A regressziós célváltozó kiválasztása</w:t>
+      </w:r>
+    </w:p>
+    <w:p>
+      <w:r>
+        <w:t>A regressziós elemzés szempontjából két, egymást kiegészítő célváltozó tekinthető relevánsnak. Az első a teljes rendszerenergia-fogyasztás egy jó darabra vetítve, a második a ciklusalapú energiafogyasztás egy jó darabra vetítve. A két mutató eltérő jellegű információt hordoz, ezért nem ugyanazt a kapcsolatot várjuk tőlük az OEE komponenseivel.</w:t>
+      </w:r>
+    </w:p>
+    <w:p>
+      <w:pPr>
+        <w:rPr>
+          <w:b/>
+          <w:bCs/>
+        </w:rPr>
+      </w:pPr>
+      <w:r>
+        <w:rPr>
+          <w:b/>
+          <w:bCs/>
+        </w:rPr>
+        <w:t>Elsődleges célváltozó:</w:t>
+      </w:r>
+    </w:p>
+    <w:p>
+      <m:oMathPara>
+        <m:oMath>
+          <m:r>
+            <m:rPr>
+              <m:sty m:val="b"/>
+            </m:rPr>
+            <w:rPr>
+              <w:rFonts w:ascii="Cambria Math" w:hAnsi="Cambria Math"/>
+              <w:color w:val="0070C0"/>
+            </w:rPr>
+            <m:t>system_energy_per_good_part_kwh</m:t>
+          </m:r>
+          <m:r>
+            <m:rPr>
+              <m:sty m:val="p"/>
+            </m:rPr>
+            <w:rPr>
+              <w:rFonts w:ascii="Cambria Math" w:hAnsi="Cambria Math" w:cs="Cambria Math"/>
+            </w:rPr>
+            <m:t>=</m:t>
+          </m:r>
+          <m:f>
+            <m:fPr>
+              <m:ctrlPr>
+                <w:rPr>
+                  <w:rFonts w:ascii="Cambria Math" w:hAnsi="Cambria Math"/>
+                </w:rPr>
+              </m:ctrlPr>
+            </m:fPr>
+            <m:num>
+              <m:sSub>
+                <m:sSubPr>
+                  <m:ctrlPr>
+                    <w:rPr>
+                      <w:rFonts w:ascii="Cambria Math" w:hAnsi="Cambria Math" w:cs="Cambria Math"/>
+                    </w:rPr>
+                  </m:ctrlPr>
+                </m:sSubPr>
+                <m:e>
+                  <m:r>
+                    <w:rPr>
+                      <w:rFonts w:ascii="Cambria Math" w:hAnsi="Cambria Math" w:cs="Cambria Math"/>
+                    </w:rPr>
+                    <m:t>E</m:t>
+                  </m:r>
+                </m:e>
+                <m:sub>
+                  <m:r>
+                    <w:rPr>
+                      <w:rFonts w:ascii="Cambria Math" w:hAnsi="Cambria Math" w:cs="Cambria Math"/>
+                    </w:rPr>
+                    <m:t>összes</m:t>
+                  </m:r>
+                </m:sub>
+              </m:sSub>
+            </m:num>
+            <m:den>
+              <m:sSub>
+                <m:sSubPr>
+                  <m:ctrlPr>
+                    <w:rPr>
+                      <w:rFonts w:ascii="Cambria Math" w:hAnsi="Cambria Math"/>
+                      <w:i/>
+                    </w:rPr>
+                  </m:ctrlPr>
+                </m:sSubPr>
+                <m:e>
+                  <m:r>
+                    <w:rPr>
+                      <w:rFonts w:ascii="Cambria Math" w:hAnsi="Cambria Math"/>
+                    </w:rPr>
+                    <m:t>N</m:t>
+                  </m:r>
+                </m:e>
+                <m:sub>
+                  <m:r>
+                    <w:rPr>
+                      <w:rFonts w:ascii="Cambria Math" w:hAnsi="Cambria Math"/>
+                    </w:rPr>
+                    <m:t>jó</m:t>
+                  </m:r>
+                </m:sub>
+              </m:sSub>
+            </m:den>
+          </m:f>
+        </m:oMath>
+      </m:oMathPara>
+    </w:p>
+    <w:p>
+      <w:pPr>
+        <w:rPr>
+          <w:b/>
+          <w:bCs/>
+        </w:rPr>
+      </w:pPr>
+      <w:r>
+        <w:rPr>
+          <w:b/>
+          <w:bCs/>
+        </w:rPr>
+        <w:t xml:space="preserve">Másodlagos, </w:t>
+      </w:r>
+      <w:r>
+        <w:rPr>
+          <w:b/>
+          <w:bCs/>
+        </w:rPr>
+        <w:t>összehasonlító</w:t>
+      </w:r>
+      <w:r>
+        <w:rPr>
+          <w:b/>
+          <w:bCs/>
+        </w:rPr>
+        <w:t xml:space="preserve"> célváltozó:</w:t>
+      </w:r>
+    </w:p>
+    <w:p>
+      <w:pPr>
+        <w:rPr>
+          <w:rFonts w:eastAsiaTheme="minorEastAsia"/>
+        </w:rPr>
+      </w:pPr>
+      <m:oMathPara>
+        <m:oMath>
+          <m:r>
+            <m:rPr>
+              <m:sty m:val="b"/>
+            </m:rPr>
+            <w:rPr>
+              <w:rFonts w:ascii="Cambria Math" w:hAnsi="Cambria Math"/>
+              <w:color w:val="0070C0"/>
+            </w:rPr>
+            <m:t>system_energy_per_good_part_kwh</m:t>
+          </m:r>
+          <m:r>
+            <m:rPr>
+              <m:sty m:val="p"/>
+            </m:rPr>
+            <w:rPr>
+              <w:rFonts w:ascii="Cambria Math" w:hAnsi="Cambria Math" w:cs="Cambria Math"/>
+            </w:rPr>
+            <m:t>=</m:t>
+          </m:r>
+          <m:f>
+            <m:fPr>
+              <m:ctrlPr>
+                <w:rPr>
+                  <w:rFonts w:ascii="Cambria Math" w:hAnsi="Cambria Math"/>
+                </w:rPr>
+              </m:ctrlPr>
+            </m:fPr>
+            <m:num>
+              <m:sSub>
+                <m:sSubPr>
+                  <m:ctrlPr>
+                    <w:rPr>
+                      <w:rFonts w:ascii="Cambria Math" w:hAnsi="Cambria Math" w:cs="Cambria Math"/>
+                    </w:rPr>
+                  </m:ctrlPr>
+                </m:sSubPr>
+                <m:e>
+                  <m:r>
+                    <w:rPr>
+                      <w:rFonts w:ascii="Cambria Math" w:hAnsi="Cambria Math" w:cs="Cambria Math"/>
+                    </w:rPr>
+                    <m:t>E</m:t>
+                  </m:r>
+                </m:e>
+                <m:sub>
+                  <m:r>
+                    <w:rPr>
+                      <w:rFonts w:ascii="Cambria Math" w:hAnsi="Cambria Math" w:cs="Cambria Math"/>
+                    </w:rPr>
+                    <m:t>ciklus jó</m:t>
+                  </m:r>
+                </m:sub>
+              </m:sSub>
+            </m:num>
+            <m:den>
+              <m:sSub>
+                <m:sSubPr>
+                  <m:ctrlPr>
+                    <w:rPr>
+                      <w:rFonts w:ascii="Cambria Math" w:hAnsi="Cambria Math"/>
+                      <w:i/>
+                    </w:rPr>
+                  </m:ctrlPr>
+                </m:sSubPr>
+                <m:e>
+                  <m:r>
+                    <w:rPr>
+                      <w:rFonts w:ascii="Cambria Math" w:hAnsi="Cambria Math"/>
+                    </w:rPr>
+                    <m:t>N</m:t>
+                  </m:r>
+                </m:e>
+                <m:sub>
+                  <m:r>
+                    <w:rPr>
+                      <w:rFonts w:ascii="Cambria Math" w:hAnsi="Cambria Math"/>
+                    </w:rPr>
+                    <m:t>jó</m:t>
+                  </m:r>
+                </m:sub>
+              </m:sSub>
+            </m:den>
+          </m:f>
+        </m:oMath>
+      </m:oMathPara>
+    </w:p>
+    <w:p/>
+    <w:p>
+      <w:r>
+        <w:t>A jelen projekt fő kutatási kérdéséhez az elsődleges célváltozó illeszkedik jobban, mivel a rendszerenergia egy jó darabra vetítve nemcsak a termelő ciklusok energiáját, hanem a nem termelő állapotok energiaigényét is tartalmazza. Ez közvetlenül kapcsolódik a rejtett energiaveszteség fogalmához, amely a projekt egyik központi problémája. A ciklusalapú célváltozó ugyanakkor hasznos kontrollmodellként szolgálhat, mert jobban tükrözi a közvetlen gyártási ciklusok energiaigényét, és alkalmas annak vizsgálatára, hogy a közvetlen termelési folyamat mennyiben magyarázza az energiaintenzitást.</w:t>
+      </w:r>
+    </w:p>
+    <w:p>
+      <w:pPr>
+        <w:rPr>
+          <w:b/>
+          <w:bCs/>
+          <w:color w:val="002060"/>
+          <w:sz w:val="24"/>
+          <w:szCs w:val="24"/>
+        </w:rPr>
+      </w:pPr>
+      <w:r>
+        <w:rPr>
+          <w:b/>
+          <w:bCs/>
+          <w:color w:val="002060"/>
+          <w:sz w:val="24"/>
+          <w:szCs w:val="24"/>
+        </w:rPr>
+        <w:lastRenderedPageBreak/>
+        <w:t>5.2. A javasolt magyarázó változók</w:t>
+      </w:r>
+    </w:p>
+    <w:p>
+      <w:r>
+        <w:t>A feladatkiírásnak megfelelően a regressziós modell alapváltozói az OEE három komponense:</w:t>
+      </w:r>
+    </w:p>
+    <w:p>
+      <w:pPr>
+        <w:jc w:val="center"/>
+      </w:pPr>
+      <w:r>
+        <w:rPr>
+          <w:b/>
+          <w:bCs/>
+          <w:color w:val="0070C0"/>
+        </w:rPr>
+        <w:t>A</w:t>
+      </w:r>
+      <w:r>
+        <w:rPr>
+          <w:color w:val="0070C0"/>
+        </w:rPr>
+        <w:t xml:space="preserve"> </w:t>
+      </w:r>
+      <w:r>
+        <w:t>=</w:t>
+      </w:r>
+      <w:r>
+        <w:t xml:space="preserve"> </w:t>
+      </w:r>
+      <w:proofErr w:type="spellStart"/>
+      <w:r>
+        <w:rPr>
+          <w:b/>
+          <w:bCs/>
+        </w:rPr>
+        <w:t>Availability</w:t>
+      </w:r>
+      <w:proofErr w:type="spellEnd"/>
+      <w:r>
+        <w:t>,</w:t>
+      </w:r>
+      <w:r>
+        <w:t xml:space="preserve"> </w:t>
+      </w:r>
+      <w:r>
+        <w:rPr>
+          <w:b/>
+          <w:bCs/>
+          <w:color w:val="0070C0"/>
+        </w:rPr>
+        <w:t>P</w:t>
+      </w:r>
+      <w:r>
+        <w:t xml:space="preserve"> </w:t>
+      </w:r>
+      <w:r>
+        <w:t>=</w:t>
+      </w:r>
+      <w:r>
+        <w:t xml:space="preserve"> </w:t>
+      </w:r>
+      <w:r>
+        <w:rPr>
+          <w:b/>
+          <w:bCs/>
+        </w:rPr>
+        <w:t>Performance</w:t>
+      </w:r>
+      <w:r>
+        <w:t>,</w:t>
+      </w:r>
+      <w:r>
+        <w:t xml:space="preserve"> </w:t>
+      </w:r>
+      <w:r>
+        <w:rPr>
+          <w:b/>
+          <w:bCs/>
+          <w:color w:val="0070C0"/>
+        </w:rPr>
+        <w:t>Q</w:t>
+      </w:r>
+      <w:r>
+        <w:t xml:space="preserve"> </w:t>
+      </w:r>
+      <w:r>
+        <w:t>=</w:t>
+      </w:r>
+      <w:r>
+        <w:t xml:space="preserve"> </w:t>
+      </w:r>
+      <w:proofErr w:type="spellStart"/>
+      <w:r>
+        <w:rPr>
+          <w:b/>
+          <w:bCs/>
+        </w:rPr>
+        <w:t>Quality</w:t>
+      </w:r>
+      <w:proofErr w:type="spellEnd"/>
+    </w:p>
+    <w:p>
+      <w:r>
+        <w:t>A bázismodell ennek megfelelően a következő alakban írható fel:</w:t>
+      </w:r>
+    </w:p>
+    <w:p>
+      <w:pPr>
+        <w:rPr>
+          <w:rFonts w:eastAsiaTheme="minorEastAsia"/>
+          <w:color w:val="000000" w:themeColor="text1"/>
+        </w:rPr>
+      </w:pPr>
+      <m:oMathPara>
+        <m:oMath>
+          <m:r>
+            <m:rPr>
+              <m:sty m:val="bi"/>
+            </m:rPr>
+            <w:rPr>
+              <w:rFonts w:ascii="Cambria Math" w:hAnsi="Cambria Math"/>
+              <w:color w:val="000000" w:themeColor="text1"/>
+            </w:rPr>
+            <m:t>Y</m:t>
+          </m:r>
+          <m:r>
+            <m:rPr>
+              <m:sty m:val="p"/>
+            </m:rPr>
+            <w:rPr>
+              <w:rFonts w:ascii="Cambria Math" w:hAnsi="Cambria Math"/>
+              <w:color w:val="000000" w:themeColor="text1"/>
+            </w:rPr>
+            <m:t>=</m:t>
+          </m:r>
+          <m:sSub>
+            <m:sSubPr>
+              <m:ctrlPr>
+                <w:rPr>
+                  <w:rFonts w:ascii="Cambria Math" w:hAnsi="Cambria Math"/>
+                  <w:i/>
+                  <w:iCs/>
+                  <w:color w:val="000000" w:themeColor="text1"/>
+                </w:rPr>
+              </m:ctrlPr>
+            </m:sSubPr>
+            <m:e>
+              <m:r>
+                <w:rPr>
+                  <w:rFonts w:ascii="Cambria Math" w:hAnsi="Cambria Math"/>
+                  <w:color w:val="000000" w:themeColor="text1"/>
+                </w:rPr>
+                <m:t>β</m:t>
+              </m:r>
+            </m:e>
+            <m:sub>
+              <m:r>
+                <w:rPr>
+                  <w:rFonts w:ascii="Cambria Math" w:hAnsi="Cambria Math"/>
+                  <w:color w:val="000000" w:themeColor="text1"/>
+                </w:rPr>
+                <m:t>0</m:t>
+              </m:r>
+            </m:sub>
+          </m:sSub>
+          <m:r>
+            <m:rPr>
+              <m:sty m:val="p"/>
+            </m:rPr>
+            <w:rPr>
+              <w:rFonts w:ascii="Cambria Math" w:hAnsi="Cambria Math"/>
+              <w:color w:val="000000" w:themeColor="text1"/>
+            </w:rPr>
+            <m:t>+</m:t>
+          </m:r>
+          <m:sSub>
+            <m:sSubPr>
+              <m:ctrlPr>
+                <w:rPr>
+                  <w:rFonts w:ascii="Cambria Math" w:hAnsi="Cambria Math"/>
+                  <w:i/>
+                  <w:iCs/>
+                  <w:color w:val="000000" w:themeColor="text1"/>
+                </w:rPr>
+              </m:ctrlPr>
+            </m:sSubPr>
+            <m:e>
+              <m:r>
+                <w:rPr>
+                  <w:rFonts w:ascii="Cambria Math" w:hAnsi="Cambria Math"/>
+                  <w:color w:val="000000" w:themeColor="text1"/>
+                </w:rPr>
+                <m:t>β</m:t>
+              </m:r>
+            </m:e>
+            <m:sub>
+              <m:r>
+                <w:rPr>
+                  <w:rFonts w:ascii="Cambria Math" w:hAnsi="Cambria Math"/>
+                  <w:color w:val="000000" w:themeColor="text1"/>
+                </w:rPr>
+                <m:t>1</m:t>
+              </m:r>
+            </m:sub>
+          </m:sSub>
+          <m:r>
+            <m:rPr>
+              <m:sty m:val="b"/>
+            </m:rPr>
+            <w:rPr>
+              <w:rFonts w:ascii="Cambria Math" w:hAnsi="Cambria Math"/>
+              <w:color w:val="0070C0"/>
+            </w:rPr>
+            <m:t>A</m:t>
+          </m:r>
+          <m:r>
+            <m:rPr>
+              <m:sty m:val="p"/>
+            </m:rPr>
+            <w:rPr>
+              <w:rFonts w:ascii="Cambria Math" w:hAnsi="Cambria Math"/>
+              <w:color w:val="000000" w:themeColor="text1"/>
+            </w:rPr>
+            <m:t>+</m:t>
+          </m:r>
+          <m:sSub>
+            <m:sSubPr>
+              <m:ctrlPr>
+                <w:rPr>
+                  <w:rFonts w:ascii="Cambria Math" w:hAnsi="Cambria Math"/>
+                  <w:i/>
+                  <w:iCs/>
+                  <w:color w:val="000000" w:themeColor="text1"/>
+                </w:rPr>
+              </m:ctrlPr>
+            </m:sSubPr>
+            <m:e>
+              <m:r>
+                <w:rPr>
+                  <w:rFonts w:ascii="Cambria Math" w:hAnsi="Cambria Math"/>
+                  <w:color w:val="000000" w:themeColor="text1"/>
+                </w:rPr>
+                <m:t>β</m:t>
+              </m:r>
+            </m:e>
+            <m:sub>
+              <m:r>
+                <w:rPr>
+                  <w:rFonts w:ascii="Cambria Math" w:hAnsi="Cambria Math"/>
+                  <w:color w:val="000000" w:themeColor="text1"/>
+                </w:rPr>
+                <m:t>2</m:t>
+              </m:r>
+            </m:sub>
+          </m:sSub>
+          <m:r>
+            <m:rPr>
+              <m:sty m:val="b"/>
+            </m:rPr>
+            <w:rPr>
+              <w:rFonts w:ascii="Cambria Math" w:hAnsi="Cambria Math"/>
+              <w:color w:val="0070C0"/>
+            </w:rPr>
+            <m:t>P</m:t>
+          </m:r>
+          <m:r>
+            <m:rPr>
+              <m:sty m:val="p"/>
+            </m:rPr>
+            <w:rPr>
+              <w:rFonts w:ascii="Cambria Math" w:hAnsi="Cambria Math"/>
+              <w:color w:val="000000" w:themeColor="text1"/>
+            </w:rPr>
+            <m:t>+</m:t>
+          </m:r>
+          <m:sSub>
+            <m:sSubPr>
+              <m:ctrlPr>
+                <w:rPr>
+                  <w:rFonts w:ascii="Cambria Math" w:hAnsi="Cambria Math"/>
+                  <w:i/>
+                  <w:iCs/>
+                  <w:color w:val="000000" w:themeColor="text1"/>
+                </w:rPr>
+              </m:ctrlPr>
+            </m:sSubPr>
+            <m:e>
+              <m:r>
+                <w:rPr>
+                  <w:rFonts w:ascii="Cambria Math" w:hAnsi="Cambria Math"/>
+                  <w:color w:val="000000" w:themeColor="text1"/>
+                </w:rPr>
+                <m:t>β</m:t>
+              </m:r>
+            </m:e>
+            <m:sub>
+              <m:r>
+                <w:rPr>
+                  <w:rFonts w:ascii="Cambria Math" w:hAnsi="Cambria Math"/>
+                  <w:color w:val="000000" w:themeColor="text1"/>
+                </w:rPr>
+                <m:t>3</m:t>
+              </m:r>
+            </m:sub>
+          </m:sSub>
+          <m:r>
+            <m:rPr>
+              <m:sty m:val="b"/>
+            </m:rPr>
+            <w:rPr>
+              <w:rFonts w:ascii="Cambria Math" w:hAnsi="Cambria Math"/>
+              <w:color w:val="0070C0"/>
+            </w:rPr>
+            <m:t>Q</m:t>
+          </m:r>
+          <m:r>
+            <m:rPr>
+              <m:sty m:val="p"/>
+            </m:rPr>
+            <w:rPr>
+              <w:rFonts w:ascii="Cambria Math" w:hAnsi="Cambria Math"/>
+              <w:color w:val="000000" w:themeColor="text1"/>
+            </w:rPr>
+            <m:t>+ε</m:t>
+          </m:r>
+        </m:oMath>
+      </m:oMathPara>
+    </w:p>
+    <w:p>
+      <w:pPr>
+        <w:rPr>
+          <w:color w:val="000000" w:themeColor="text1"/>
+        </w:rPr>
+      </w:pPr>
+      <w:r>
+        <w:rPr>
+          <w:color w:val="000000" w:themeColor="text1"/>
+        </w:rPr>
+        <w:t>A gyakorlati megvalósítás során azonban célszerű kiegészítő kontrollváltozókat is figyelembe venni, amennyiben az adatok mennyisége ezt lehetővé teszi. Ilyen lehet például:</w:t>
+      </w:r>
+    </w:p>
+    <w:p>
+      <w:pPr>
+        <w:pStyle w:val="Listaszerbekezds"/>
+        <w:numPr>
+          <w:ilvl w:val="0"/>
+          <w:numId w:val="15"/>
+        </w:numPr>
+        <w:rPr>
+          <w:color w:val="000000" w:themeColor="text1"/>
+        </w:rPr>
+      </w:pPr>
+      <w:r>
+        <w:rPr>
+          <w:color w:val="000000" w:themeColor="text1"/>
+        </w:rPr>
+        <w:t xml:space="preserve">a </w:t>
+      </w:r>
+      <w:proofErr w:type="spellStart"/>
+      <w:r>
+        <w:rPr>
+          <w:rFonts w:ascii="Consolas" w:hAnsi="Consolas"/>
+          <w:b/>
+          <w:bCs/>
+          <w:color w:val="0070C0"/>
+          <w:sz w:val="20"/>
+          <w:szCs w:val="20"/>
+        </w:rPr>
+        <w:t>good_parts</w:t>
+      </w:r>
+      <w:proofErr w:type="spellEnd"/>
+      <w:r>
+        <w:rPr>
+          <w:color w:val="000000" w:themeColor="text1"/>
+        </w:rPr>
+        <w:t>,</w:t>
+      </w:r>
+    </w:p>
+    <w:p>
+      <w:pPr>
+        <w:pStyle w:val="Listaszerbekezds"/>
+        <w:numPr>
+          <w:ilvl w:val="0"/>
+          <w:numId w:val="15"/>
+        </w:numPr>
+        <w:rPr>
+          <w:color w:val="000000" w:themeColor="text1"/>
+        </w:rPr>
+      </w:pPr>
+      <w:r>
+        <w:rPr>
+          <w:color w:val="000000" w:themeColor="text1"/>
+        </w:rPr>
+        <w:t xml:space="preserve">a </w:t>
+      </w:r>
+      <w:proofErr w:type="spellStart"/>
+      <w:r>
+        <w:rPr>
+          <w:rFonts w:ascii="Consolas" w:hAnsi="Consolas"/>
+          <w:b/>
+          <w:bCs/>
+          <w:color w:val="0070C0"/>
+          <w:sz w:val="20"/>
+          <w:szCs w:val="20"/>
+        </w:rPr>
+        <w:t>total_parts</w:t>
+      </w:r>
+      <w:proofErr w:type="spellEnd"/>
+      <w:r>
+        <w:rPr>
+          <w:color w:val="000000" w:themeColor="text1"/>
+        </w:rPr>
+        <w:t>,</w:t>
+      </w:r>
+    </w:p>
+    <w:p>
+      <w:pPr>
+        <w:pStyle w:val="Listaszerbekezds"/>
+        <w:numPr>
+          <w:ilvl w:val="0"/>
+          <w:numId w:val="15"/>
+        </w:numPr>
+        <w:rPr>
+          <w:color w:val="000000" w:themeColor="text1"/>
+        </w:rPr>
+      </w:pPr>
+      <w:r>
+        <w:rPr>
+          <w:color w:val="000000" w:themeColor="text1"/>
+        </w:rPr>
+        <w:t xml:space="preserve">a </w:t>
+      </w:r>
+      <w:proofErr w:type="spellStart"/>
+      <w:r>
+        <w:rPr>
+          <w:rFonts w:ascii="Consolas" w:hAnsi="Consolas"/>
+          <w:b/>
+          <w:bCs/>
+          <w:color w:val="0070C0"/>
+          <w:sz w:val="20"/>
+          <w:szCs w:val="20"/>
+        </w:rPr>
+        <w:t>scrap_rate</w:t>
+      </w:r>
+      <w:proofErr w:type="spellEnd"/>
+      <w:r>
+        <w:rPr>
+          <w:color w:val="000000" w:themeColor="text1"/>
+        </w:rPr>
+        <w:t>,</w:t>
+      </w:r>
+    </w:p>
+    <w:p>
+      <w:pPr>
+        <w:pStyle w:val="Listaszerbekezds"/>
+        <w:numPr>
+          <w:ilvl w:val="0"/>
+          <w:numId w:val="15"/>
+        </w:numPr>
+        <w:rPr>
+          <w:color w:val="000000" w:themeColor="text1"/>
+        </w:rPr>
+      </w:pPr>
+      <w:r>
+        <w:rPr>
+          <w:color w:val="000000" w:themeColor="text1"/>
+        </w:rPr>
+        <w:t xml:space="preserve">valamint a </w:t>
+      </w:r>
+      <w:proofErr w:type="spellStart"/>
+      <w:r>
+        <w:rPr>
+          <w:rFonts w:ascii="Consolas" w:hAnsi="Consolas"/>
+          <w:b/>
+          <w:bCs/>
+          <w:color w:val="0070C0"/>
+          <w:sz w:val="20"/>
+          <w:szCs w:val="20"/>
+        </w:rPr>
+        <w:t>non_productive_energy_ratio</w:t>
+      </w:r>
+      <w:proofErr w:type="spellEnd"/>
+      <w:r>
+        <w:rPr>
+          <w:color w:val="000000" w:themeColor="text1"/>
+        </w:rPr>
+        <w:t>.</w:t>
+      </w:r>
+    </w:p>
+    <w:p>
+      <w:pPr>
+        <w:rPr>
+          <w:color w:val="000000" w:themeColor="text1"/>
+        </w:rPr>
+      </w:pPr>
+      <w:r>
+        <w:rPr>
+          <w:color w:val="000000" w:themeColor="text1"/>
+        </w:rPr>
+        <w:t>Ezek a változók segíthetnek elkülöníteni a pusztán az OEE komponenseiből adódó hatásokat az olyan torzító tényezőktől, mint az alacsony darabszám, a magas selejtarány vagy a kiugró nem termelő energiaarány. Különösen fontos ez azért, mert az egy jó darabra jutó energiafogyasztás nevezője érzékeny a kis darabszámokra, így a megfelelő kontrollváltozók használata növelheti a modell stabilitását és értelmezhetőségét.</w:t>
+      </w:r>
+    </w:p>
+    <w:p>
+      <w:pPr>
+        <w:rPr>
+          <w:b/>
+          <w:bCs/>
+          <w:color w:val="002060"/>
+          <w:sz w:val="24"/>
+          <w:szCs w:val="24"/>
+        </w:rPr>
+      </w:pPr>
+      <w:r>
+        <w:rPr>
+          <w:b/>
+          <w:bCs/>
+          <w:color w:val="002060"/>
+          <w:sz w:val="24"/>
+          <w:szCs w:val="24"/>
+        </w:rPr>
+        <w:t>5.3. A javasolt modellcsalád</w:t>
+      </w:r>
+    </w:p>
+    <w:p>
+      <w:pPr>
+        <w:rPr>
+          <w:color w:val="000000" w:themeColor="text1"/>
+        </w:rPr>
+      </w:pPr>
+      <w:r>
+        <w:rPr>
+          <w:color w:val="000000" w:themeColor="text1"/>
+        </w:rPr>
+        <w:t>A regressziós célváltozó pozitív, folytonos és várhatóan pozitív ferdeségű (jobbra ferde) eloszlású mennyiség, ezért a modellválasztásnál ezt figyelembe kell venni.</w:t>
+      </w:r>
+      <w:r>
+        <w:rPr>
+          <w:color w:val="000000" w:themeColor="text1"/>
+        </w:rPr>
+        <w:t xml:space="preserve"> </w:t>
+      </w:r>
+      <w:r>
+        <w:rPr>
+          <w:color w:val="000000" w:themeColor="text1"/>
+        </w:rPr>
+        <w:t>A gyakorlati megvalósítás során két modell használata javasolt, de eltérő prioritással.</w:t>
+      </w:r>
+    </w:p>
+    <w:p>
+      <w:pPr>
+        <w:rPr>
+          <w:b/>
+          <w:bCs/>
+          <w:color w:val="000000" w:themeColor="text1"/>
+        </w:rPr>
+      </w:pPr>
+      <w:r>
+        <w:rPr>
+          <w:b/>
+          <w:bCs/>
+          <w:color w:val="000000" w:themeColor="text1"/>
+        </w:rPr>
+        <w:t>Elsődleges főmodell: Gamma típusú generalizált lineáris modell log linkkel</w:t>
+      </w:r>
+    </w:p>
+    <w:p>
+      <w:pPr>
+        <w:rPr>
+          <w:rFonts w:eastAsiaTheme="minorEastAsia"/>
+          <w:color w:val="000000" w:themeColor="text1"/>
+        </w:rPr>
+      </w:pPr>
+      <m:oMathPara>
+        <m:oMath>
+          <m:r>
+            <w:rPr>
+              <w:rFonts w:ascii="Cambria Math" w:hAnsi="Cambria Math"/>
+              <w:color w:val="000000" w:themeColor="text1"/>
+            </w:rPr>
+            <m:t>E(Y|X)</m:t>
+          </m:r>
+          <m:r>
+            <m:rPr>
+              <m:sty m:val="p"/>
+            </m:rPr>
+            <w:rPr>
+              <w:rFonts w:ascii="Cambria Math" w:hAnsi="Cambria Math"/>
+              <w:color w:val="000000" w:themeColor="text1"/>
+            </w:rPr>
+            <m:t>=</m:t>
+          </m:r>
+          <m:sSub>
+            <m:sSubPr>
+              <m:ctrlPr>
+                <w:rPr>
+                  <w:rFonts w:ascii="Cambria Math" w:hAnsi="Cambria Math"/>
+                  <w:i/>
+                  <w:iCs/>
+                  <w:color w:val="000000" w:themeColor="text1"/>
+                </w:rPr>
+              </m:ctrlPr>
+            </m:sSubPr>
+            <m:e>
+              <m:r>
+                <m:rPr>
+                  <m:sty m:val="p"/>
+                </m:rPr>
+                <w:rPr>
+                  <w:rFonts w:ascii="Cambria Math" w:hAnsi="Cambria Math"/>
+                  <w:color w:val="000000" w:themeColor="text1"/>
+                </w:rPr>
+                <m:t>exp(</m:t>
+              </m:r>
+              <m:r>
+                <w:rPr>
+                  <w:rFonts w:ascii="Cambria Math" w:hAnsi="Cambria Math"/>
+                  <w:color w:val="000000" w:themeColor="text1"/>
+                </w:rPr>
+                <m:t>β</m:t>
+              </m:r>
+            </m:e>
+            <m:sub>
+              <m:r>
+                <w:rPr>
+                  <w:rFonts w:ascii="Cambria Math" w:hAnsi="Cambria Math"/>
+                  <w:color w:val="000000" w:themeColor="text1"/>
+                </w:rPr>
+                <m:t>0</m:t>
+              </m:r>
+            </m:sub>
+          </m:sSub>
+          <m:r>
+            <m:rPr>
+              <m:sty m:val="p"/>
+            </m:rPr>
+            <w:rPr>
+              <w:rFonts w:ascii="Cambria Math" w:hAnsi="Cambria Math"/>
+              <w:color w:val="000000" w:themeColor="text1"/>
+            </w:rPr>
+            <m:t>+</m:t>
+          </m:r>
+          <m:sSub>
+            <m:sSubPr>
+              <m:ctrlPr>
+                <w:rPr>
+                  <w:rFonts w:ascii="Cambria Math" w:hAnsi="Cambria Math"/>
+                  <w:i/>
+                  <w:iCs/>
+                  <w:color w:val="000000" w:themeColor="text1"/>
+                </w:rPr>
+              </m:ctrlPr>
+            </m:sSubPr>
+            <m:e>
+              <m:r>
+                <w:rPr>
+                  <w:rFonts w:ascii="Cambria Math" w:hAnsi="Cambria Math"/>
+                  <w:color w:val="000000" w:themeColor="text1"/>
+                </w:rPr>
+                <m:t>β</m:t>
+              </m:r>
+            </m:e>
+            <m:sub>
+              <m:r>
+                <w:rPr>
+                  <w:rFonts w:ascii="Cambria Math" w:hAnsi="Cambria Math"/>
+                  <w:color w:val="000000" w:themeColor="text1"/>
+                </w:rPr>
+                <m:t>1</m:t>
+              </m:r>
+            </m:sub>
+          </m:sSub>
+          <m:r>
+            <m:rPr>
+              <m:sty m:val="b"/>
+            </m:rPr>
+            <w:rPr>
+              <w:rFonts w:ascii="Cambria Math" w:hAnsi="Cambria Math"/>
+              <w:color w:val="0070C0"/>
+            </w:rPr>
+            <m:t>A</m:t>
+          </m:r>
+          <m:r>
+            <m:rPr>
+              <m:sty m:val="p"/>
+            </m:rPr>
+            <w:rPr>
+              <w:rFonts w:ascii="Cambria Math" w:hAnsi="Cambria Math"/>
+              <w:color w:val="000000" w:themeColor="text1"/>
+            </w:rPr>
+            <m:t>+</m:t>
+          </m:r>
+          <m:sSub>
+            <m:sSubPr>
+              <m:ctrlPr>
+                <w:rPr>
+                  <w:rFonts w:ascii="Cambria Math" w:hAnsi="Cambria Math"/>
+                  <w:i/>
+                  <w:iCs/>
+                  <w:color w:val="000000" w:themeColor="text1"/>
+                </w:rPr>
+              </m:ctrlPr>
+            </m:sSubPr>
+            <m:e>
+              <m:r>
+                <w:rPr>
+                  <w:rFonts w:ascii="Cambria Math" w:hAnsi="Cambria Math"/>
+                  <w:color w:val="000000" w:themeColor="text1"/>
+                </w:rPr>
+                <m:t>β</m:t>
+              </m:r>
+            </m:e>
+            <m:sub>
+              <m:r>
+                <w:rPr>
+                  <w:rFonts w:ascii="Cambria Math" w:hAnsi="Cambria Math"/>
+                  <w:color w:val="000000" w:themeColor="text1"/>
+                </w:rPr>
+                <m:t>2</m:t>
+              </m:r>
+            </m:sub>
+          </m:sSub>
+          <m:r>
+            <m:rPr>
+              <m:sty m:val="b"/>
+            </m:rPr>
+            <w:rPr>
+              <w:rFonts w:ascii="Cambria Math" w:hAnsi="Cambria Math"/>
+              <w:color w:val="0070C0"/>
+            </w:rPr>
+            <m:t>P</m:t>
+          </m:r>
+          <m:r>
+            <m:rPr>
+              <m:sty m:val="p"/>
+            </m:rPr>
+            <w:rPr>
+              <w:rFonts w:ascii="Cambria Math" w:hAnsi="Cambria Math"/>
+              <w:color w:val="000000" w:themeColor="text1"/>
+            </w:rPr>
+            <m:t>+</m:t>
+          </m:r>
+          <m:sSub>
+            <m:sSubPr>
+              <m:ctrlPr>
+                <w:rPr>
+                  <w:rFonts w:ascii="Cambria Math" w:hAnsi="Cambria Math"/>
+                  <w:i/>
+                  <w:iCs/>
+                  <w:color w:val="000000" w:themeColor="text1"/>
+                </w:rPr>
+              </m:ctrlPr>
+            </m:sSubPr>
+            <m:e>
+              <m:r>
+                <w:rPr>
+                  <w:rFonts w:ascii="Cambria Math" w:hAnsi="Cambria Math"/>
+                  <w:color w:val="000000" w:themeColor="text1"/>
+                </w:rPr>
+                <m:t>β</m:t>
+              </m:r>
+            </m:e>
+            <m:sub>
+              <m:r>
+                <w:rPr>
+                  <w:rFonts w:ascii="Cambria Math" w:hAnsi="Cambria Math"/>
+                  <w:color w:val="000000" w:themeColor="text1"/>
+                </w:rPr>
+                <m:t>3</m:t>
+              </m:r>
+            </m:sub>
+          </m:sSub>
+          <m:r>
+            <m:rPr>
+              <m:sty m:val="b"/>
+            </m:rPr>
+            <w:rPr>
+              <w:rFonts w:ascii="Cambria Math" w:hAnsi="Cambria Math"/>
+              <w:color w:val="0070C0"/>
+            </w:rPr>
+            <m:t>Q</m:t>
+          </m:r>
+          <m:r>
+            <m:rPr>
+              <m:sty m:val="p"/>
+            </m:rPr>
+            <w:rPr>
+              <w:rFonts w:ascii="Cambria Math" w:hAnsi="Cambria Math"/>
+              <w:color w:val="000000" w:themeColor="text1"/>
+            </w:rPr>
+            <m:t>)</m:t>
+          </m:r>
+        </m:oMath>
+      </m:oMathPara>
+    </w:p>
+    <w:p>
+      <w:pPr>
+        <w:rPr>
+          <w:b/>
+          <w:bCs/>
+          <w:color w:val="000000" w:themeColor="text1"/>
+        </w:rPr>
+      </w:pPr>
+      <w:r>
+        <w:rPr>
+          <w:b/>
+          <w:bCs/>
+          <w:color w:val="000000" w:themeColor="text1"/>
+        </w:rPr>
+        <w:t>Másodlagos bázis- vagy kontrollmodell: log-transzformált lineáris regresszió</w:t>
+      </w:r>
+    </w:p>
+    <w:p>
+      <w:pPr>
+        <w:rPr>
+          <w:rFonts w:eastAsiaTheme="minorEastAsia"/>
+          <w:iCs/>
+          <w:color w:val="000000" w:themeColor="text1"/>
+        </w:rPr>
+      </w:pPr>
+      <m:oMathPara>
+        <m:oMath>
+          <m:r>
+            <w:rPr>
+              <w:rFonts w:ascii="Cambria Math" w:hAnsi="Cambria Math"/>
+              <w:color w:val="000000" w:themeColor="text1"/>
+            </w:rPr>
+            <m:t>log(Y)</m:t>
+          </m:r>
+          <m:r>
+            <m:rPr>
+              <m:sty m:val="p"/>
+            </m:rPr>
+            <w:rPr>
+              <w:rFonts w:ascii="Cambria Math" w:hAnsi="Cambria Math"/>
+              <w:color w:val="000000" w:themeColor="text1"/>
+            </w:rPr>
+            <m:t>=</m:t>
+          </m:r>
+          <m:sSub>
+            <m:sSubPr>
+              <m:ctrlPr>
+                <w:rPr>
+                  <w:rFonts w:ascii="Cambria Math" w:hAnsi="Cambria Math"/>
+                  <w:i/>
+                  <w:iCs/>
+                  <w:color w:val="000000" w:themeColor="text1"/>
+                </w:rPr>
+              </m:ctrlPr>
+            </m:sSubPr>
+            <m:e>
+              <m:r>
+                <w:rPr>
+                  <w:rFonts w:ascii="Cambria Math" w:hAnsi="Cambria Math"/>
+                  <w:color w:val="000000" w:themeColor="text1"/>
+                </w:rPr>
+                <m:t>β</m:t>
+              </m:r>
+            </m:e>
+            <m:sub>
+              <m:r>
+                <w:rPr>
+                  <w:rFonts w:ascii="Cambria Math" w:hAnsi="Cambria Math"/>
+                  <w:color w:val="000000" w:themeColor="text1"/>
+                </w:rPr>
+                <m:t>0</m:t>
+              </m:r>
+            </m:sub>
+          </m:sSub>
+          <m:r>
+            <m:rPr>
+              <m:sty m:val="p"/>
+            </m:rPr>
+            <w:rPr>
+              <w:rFonts w:ascii="Cambria Math" w:hAnsi="Cambria Math"/>
+              <w:color w:val="000000" w:themeColor="text1"/>
+            </w:rPr>
+            <m:t>+</m:t>
+          </m:r>
+          <m:sSub>
+            <m:sSubPr>
+              <m:ctrlPr>
+                <w:rPr>
+                  <w:rFonts w:ascii="Cambria Math" w:hAnsi="Cambria Math"/>
+                  <w:i/>
+                  <w:iCs/>
+                  <w:color w:val="000000" w:themeColor="text1"/>
+                </w:rPr>
+              </m:ctrlPr>
+            </m:sSubPr>
+            <m:e>
+              <m:r>
+                <w:rPr>
+                  <w:rFonts w:ascii="Cambria Math" w:hAnsi="Cambria Math"/>
+                  <w:color w:val="000000" w:themeColor="text1"/>
+                </w:rPr>
+                <m:t>β</m:t>
+              </m:r>
+            </m:e>
+            <m:sub>
+              <m:r>
+                <w:rPr>
+                  <w:rFonts w:ascii="Cambria Math" w:hAnsi="Cambria Math"/>
+                  <w:color w:val="000000" w:themeColor="text1"/>
+                </w:rPr>
+                <m:t>1</m:t>
+              </m:r>
+            </m:sub>
+          </m:sSub>
+          <m:r>
+            <m:rPr>
+              <m:sty m:val="b"/>
+            </m:rPr>
+            <w:rPr>
+              <w:rFonts w:ascii="Cambria Math" w:hAnsi="Cambria Math"/>
+              <w:color w:val="0070C0"/>
+            </w:rPr>
+            <m:t>A</m:t>
+          </m:r>
+          <m:r>
+            <m:rPr>
+              <m:sty m:val="p"/>
+            </m:rPr>
+            <w:rPr>
+              <w:rFonts w:ascii="Cambria Math" w:hAnsi="Cambria Math"/>
+              <w:color w:val="000000" w:themeColor="text1"/>
+            </w:rPr>
+            <m:t>+</m:t>
+          </m:r>
+          <m:sSub>
+            <m:sSubPr>
+              <m:ctrlPr>
+                <w:rPr>
+                  <w:rFonts w:ascii="Cambria Math" w:hAnsi="Cambria Math"/>
+                  <w:i/>
+                  <w:iCs/>
+                  <w:color w:val="000000" w:themeColor="text1"/>
+                </w:rPr>
+              </m:ctrlPr>
+            </m:sSubPr>
+            <m:e>
+              <m:r>
+                <w:rPr>
+                  <w:rFonts w:ascii="Cambria Math" w:hAnsi="Cambria Math"/>
+                  <w:color w:val="000000" w:themeColor="text1"/>
+                </w:rPr>
+                <m:t>β</m:t>
+              </m:r>
+            </m:e>
+            <m:sub>
+              <m:r>
+                <w:rPr>
+                  <w:rFonts w:ascii="Cambria Math" w:hAnsi="Cambria Math"/>
+                  <w:color w:val="000000" w:themeColor="text1"/>
+                </w:rPr>
+                <m:t>2</m:t>
+              </m:r>
+            </m:sub>
+          </m:sSub>
+          <m:r>
+            <m:rPr>
+              <m:sty m:val="b"/>
+            </m:rPr>
+            <w:rPr>
+              <w:rFonts w:ascii="Cambria Math" w:hAnsi="Cambria Math"/>
+              <w:color w:val="0070C0"/>
+            </w:rPr>
+            <m:t>P</m:t>
+          </m:r>
+          <m:r>
+            <m:rPr>
+              <m:sty m:val="p"/>
+            </m:rPr>
+            <w:rPr>
+              <w:rFonts w:ascii="Cambria Math" w:hAnsi="Cambria Math"/>
+              <w:color w:val="000000" w:themeColor="text1"/>
+            </w:rPr>
+            <m:t>+</m:t>
+          </m:r>
+          <m:sSub>
+            <m:sSubPr>
+              <m:ctrlPr>
+                <w:rPr>
+                  <w:rFonts w:ascii="Cambria Math" w:hAnsi="Cambria Math"/>
+                  <w:i/>
+                  <w:iCs/>
+                  <w:color w:val="000000" w:themeColor="text1"/>
+                </w:rPr>
+              </m:ctrlPr>
+            </m:sSubPr>
+            <m:e>
+              <m:r>
+                <w:rPr>
+                  <w:rFonts w:ascii="Cambria Math" w:hAnsi="Cambria Math"/>
+                  <w:color w:val="000000" w:themeColor="text1"/>
+                </w:rPr>
+                <m:t>β</m:t>
+              </m:r>
+            </m:e>
+            <m:sub>
+              <m:r>
+                <w:rPr>
+                  <w:rFonts w:ascii="Cambria Math" w:hAnsi="Cambria Math"/>
+                  <w:color w:val="000000" w:themeColor="text1"/>
+                </w:rPr>
+                <m:t>3</m:t>
+              </m:r>
+            </m:sub>
+          </m:sSub>
+          <m:r>
+            <m:rPr>
+              <m:sty m:val="b"/>
+            </m:rPr>
+            <w:rPr>
+              <w:rFonts w:ascii="Cambria Math" w:hAnsi="Cambria Math"/>
+              <w:color w:val="0070C0"/>
+            </w:rPr>
+            <m:t>Q</m:t>
+          </m:r>
+          <m:r>
+            <m:rPr>
+              <m:sty m:val="p"/>
+            </m:rPr>
+            <w:rPr>
+              <w:rFonts w:ascii="Cambria Math" w:hAnsi="Cambria Math"/>
+              <w:color w:val="000000" w:themeColor="text1"/>
+            </w:rPr>
+            <m:t>+ε</m:t>
+          </m:r>
+        </m:oMath>
+      </m:oMathPara>
+    </w:p>
+    <w:p>
+      <w:r>
+        <w:t xml:space="preserve">A Gamma GLM elsődleges használata azért indokolt, mert az energiaintenzitási mutató kWh/jó darab típusú pozitív folytonos mennyiség, amelynek eloszlása jellemzően nem normális. A Gamma eloszlás és a log link ezért természetesebb választás, és </w:t>
+      </w:r>
+      <w:proofErr w:type="spellStart"/>
+      <w:r>
+        <w:t>statisztikailag</w:t>
+      </w:r>
+      <w:proofErr w:type="spellEnd"/>
+      <w:r>
+        <w:t xml:space="preserve"> jobban illeszkedik a vizsgált jelenséghez. A log-transzformált OLS ugyanakkor egyszerűbben kommunikálható, könnyebben értelmezhető, és jól használható összehasonlító vagy kontrollmodellként.</w:t>
+      </w:r>
+    </w:p>
+    <w:p>
+      <w:pPr>
+        <w:rPr>
+          <w:b/>
+          <w:bCs/>
+          <w:color w:val="002060"/>
+          <w:sz w:val="24"/>
+          <w:szCs w:val="24"/>
+        </w:rPr>
+      </w:pPr>
+      <w:r>
+        <w:rPr>
+          <w:b/>
+          <w:bCs/>
+          <w:color w:val="002060"/>
+          <w:sz w:val="24"/>
+          <w:szCs w:val="24"/>
+        </w:rPr>
+        <w:t>5.4. A regresszióhoz előkészített adatréteg</w:t>
+      </w:r>
+    </w:p>
+    <w:p>
+      <w:r>
+        <w:t>A jelenlegi órás aggregált nézetek jó kiindulási alapot adnak, de a regresszióhoz célszerű egy külön inputnézetet létrehozni, amelyben egyetlen táblában együtt szerepel minden szükséges cél- és magyarázó változó. Ennek célja, hogy a modellépítés során ne több nézetből kelljen összekapcsolni az adatokat, hanem egy egységes regressziós inputréteg álljon rendelkezésre.</w:t>
+      </w:r>
+    </w:p>
+    <w:p>
+      <w:r>
+        <w:t xml:space="preserve">A túl zajos megfigyelések elkerülése érdekében a regressziós inputréteg </w:t>
+      </w:r>
+      <w:proofErr w:type="spellStart"/>
+      <w:r>
+        <w:t>aggregációs</w:t>
+      </w:r>
+      <w:proofErr w:type="spellEnd"/>
+      <w:r>
+        <w:t xml:space="preserve"> szintjét célszerű </w:t>
+      </w:r>
+      <w:proofErr w:type="spellStart"/>
+      <w:r>
+        <w:t>paraméterezhetővé</w:t>
+      </w:r>
+      <w:proofErr w:type="spellEnd"/>
+      <w:r>
+        <w:t xml:space="preserve"> tenni. Ennek megfelelően a regressziós </w:t>
+      </w:r>
+      <w:proofErr w:type="spellStart"/>
+      <w:r>
+        <w:t>pipeline</w:t>
+      </w:r>
+      <w:proofErr w:type="spellEnd"/>
+      <w:r>
+        <w:t xml:space="preserve"> egy külön konfigurációs fájlban tárolhatja az alkalmazott időablakot, például 1 órás, 4 órás vagy műszakszintű </w:t>
+      </w:r>
+      <w:proofErr w:type="spellStart"/>
+      <w:r>
+        <w:t>aggregáció</w:t>
+      </w:r>
+      <w:proofErr w:type="spellEnd"/>
+      <w:r>
+        <w:t xml:space="preserve"> formájában. Ez lehetővé teszi, hogy ugyanaz a modellépítési logika különböző </w:t>
+      </w:r>
+      <w:proofErr w:type="spellStart"/>
+      <w:r>
+        <w:t>aggregációs</w:t>
+      </w:r>
+      <w:proofErr w:type="spellEnd"/>
+      <w:r>
+        <w:t xml:space="preserve"> szinteken is kipróbálható és összehasonlítható legyen.</w:t>
+      </w:r>
+      <w:r>
+        <w:t xml:space="preserve"> </w:t>
+      </w:r>
+    </w:p>
+    <w:p>
+      <w:r>
+        <w:t>A javasolt regressziós inputnézet mezői például a következők lehetnek:</w:t>
+      </w:r>
+    </w:p>
+    <w:p>
+      <w:pPr>
+        <w:pStyle w:val="Listaszerbekezds"/>
+        <w:numPr>
+          <w:ilvl w:val="0"/>
+          <w:numId w:val="16"/>
+        </w:numPr>
+      </w:pPr>
+      <w:proofErr w:type="spellStart"/>
+      <w:r>
+        <w:rPr>
+          <w:rFonts w:ascii="Consolas" w:hAnsi="Consolas"/>
+          <w:b/>
+          <w:bCs/>
+          <w:color w:val="0070C0"/>
+          <w:sz w:val="20"/>
+          <w:szCs w:val="20"/>
+        </w:rPr>
+        <w:t>bucket_start</w:t>
+      </w:r>
+      <w:proofErr w:type="spellEnd"/>
+      <w:r>
+        <w:t>,</w:t>
+      </w:r>
+      <w:r>
+        <w:t xml:space="preserve"> - </w:t>
+      </w:r>
+      <w:r>
+        <w:t>az aggregált időablak kezdő időpontja</w:t>
+      </w:r>
+    </w:p>
+    <w:p>
+      <w:pPr>
+        <w:pStyle w:val="Listaszerbekezds"/>
+        <w:numPr>
+          <w:ilvl w:val="0"/>
+          <w:numId w:val="16"/>
+        </w:numPr>
+      </w:pPr>
+      <w:proofErr w:type="spellStart"/>
+      <w:r>
+        <w:rPr>
+          <w:rFonts w:ascii="Consolas" w:hAnsi="Consolas"/>
+          <w:b/>
+          <w:bCs/>
+          <w:color w:val="0070C0"/>
+          <w:sz w:val="20"/>
+          <w:szCs w:val="20"/>
+        </w:rPr>
+        <w:t>machine_id</w:t>
+      </w:r>
+      <w:proofErr w:type="spellEnd"/>
+      <w:r>
+        <w:t>,</w:t>
+      </w:r>
+      <w:r>
+        <w:t xml:space="preserve"> </w:t>
+      </w:r>
+      <w:r>
+        <w:t>– a vizsgált gép azonosítója</w:t>
+      </w:r>
+    </w:p>
+    <w:p>
+      <w:pPr>
+        <w:pStyle w:val="Listaszerbekezds"/>
+        <w:numPr>
+          <w:ilvl w:val="0"/>
+          <w:numId w:val="16"/>
+        </w:numPr>
+        <w:rPr>
+          <w:i/>
+          <w:iCs/>
+          <w:color w:val="767171" w:themeColor="background2" w:themeShade="80"/>
+        </w:rPr>
+      </w:pPr>
+      <w:proofErr w:type="spellStart"/>
+      <w:r>
+        <w:rPr>
+          <w:rFonts w:ascii="Consolas" w:hAnsi="Consolas"/>
+          <w:b/>
+          <w:bCs/>
+          <w:color w:val="0070C0"/>
+          <w:sz w:val="20"/>
+          <w:szCs w:val="20"/>
+        </w:rPr>
+        <w:lastRenderedPageBreak/>
+        <w:t>availability</w:t>
+      </w:r>
+      <w:proofErr w:type="spellEnd"/>
+      <w:r>
+        <w:t>,</w:t>
+      </w:r>
+      <w:r>
+        <w:t xml:space="preserve"> </w:t>
+      </w:r>
+      <w:r>
+        <w:tab/>
+      </w:r>
+      <w:r>
+        <w:rPr>
+          <w:i/>
+          <w:iCs/>
+          <w:color w:val="767171" w:themeColor="background2" w:themeShade="80"/>
+        </w:rPr>
+        <w:t>– a rendelkezésre állás mutatója az adott időablakban</w:t>
+      </w:r>
+    </w:p>
+    <w:p>
+      <w:pPr>
+        <w:pStyle w:val="Listaszerbekezds"/>
+        <w:numPr>
+          <w:ilvl w:val="0"/>
+          <w:numId w:val="16"/>
+        </w:numPr>
+      </w:pPr>
+      <w:r>
+        <w:rPr>
+          <w:rFonts w:ascii="Consolas" w:hAnsi="Consolas"/>
+          <w:b/>
+          <w:bCs/>
+          <w:color w:val="0070C0"/>
+          <w:sz w:val="20"/>
+          <w:szCs w:val="20"/>
+        </w:rPr>
+        <w:t>performance</w:t>
+      </w:r>
+      <w:r>
+        <w:t>,</w:t>
+      </w:r>
+      <w:r>
+        <w:tab/>
+      </w:r>
+      <w:r>
+        <w:t xml:space="preserve"> </w:t>
+      </w:r>
+      <w:r>
+        <w:rPr>
+          <w:i/>
+          <w:iCs/>
+          <w:color w:val="767171" w:themeColor="background2" w:themeShade="80"/>
+        </w:rPr>
+        <w:t>– a teljesítmény mutatója az adott időablakban</w:t>
+      </w:r>
+    </w:p>
+    <w:p>
+      <w:pPr>
+        <w:pStyle w:val="Listaszerbekezds"/>
+        <w:numPr>
+          <w:ilvl w:val="0"/>
+          <w:numId w:val="16"/>
+        </w:numPr>
+      </w:pPr>
+      <w:proofErr w:type="spellStart"/>
+      <w:r>
+        <w:rPr>
+          <w:rFonts w:ascii="Consolas" w:hAnsi="Consolas"/>
+          <w:b/>
+          <w:bCs/>
+          <w:color w:val="0070C0"/>
+          <w:sz w:val="20"/>
+          <w:szCs w:val="20"/>
+        </w:rPr>
+        <w:t>quality</w:t>
+      </w:r>
+      <w:proofErr w:type="spellEnd"/>
+      <w:r>
+        <w:t>,</w:t>
+      </w:r>
+      <w:r>
+        <w:rPr>
+          <w:i/>
+          <w:iCs/>
+          <w:color w:val="767171" w:themeColor="background2" w:themeShade="80"/>
+        </w:rPr>
+        <w:tab/>
+      </w:r>
+      <w:r>
+        <w:rPr>
+          <w:i/>
+          <w:iCs/>
+          <w:color w:val="767171" w:themeColor="background2" w:themeShade="80"/>
+        </w:rPr>
+        <w:t xml:space="preserve"> </w:t>
+      </w:r>
+      <w:r>
+        <w:rPr>
+          <w:i/>
+          <w:iCs/>
+          <w:color w:val="767171" w:themeColor="background2" w:themeShade="80"/>
+        </w:rPr>
+        <w:t>– a minőségi mutató az adott időablakban</w:t>
+      </w:r>
+    </w:p>
+    <w:p>
+      <w:pPr>
+        <w:pStyle w:val="Listaszerbekezds"/>
+        <w:numPr>
+          <w:ilvl w:val="0"/>
+          <w:numId w:val="16"/>
+        </w:numPr>
+        <w:rPr>
+          <w:i/>
+          <w:iCs/>
+          <w:color w:val="767171" w:themeColor="background2" w:themeShade="80"/>
+        </w:rPr>
+      </w:pPr>
+      <w:proofErr w:type="spellStart"/>
+      <w:r>
+        <w:rPr>
+          <w:rFonts w:ascii="Consolas" w:hAnsi="Consolas"/>
+          <w:b/>
+          <w:bCs/>
+          <w:color w:val="0070C0"/>
+          <w:sz w:val="20"/>
+          <w:szCs w:val="20"/>
+        </w:rPr>
+        <w:t>oee</w:t>
+      </w:r>
+      <w:proofErr w:type="spellEnd"/>
+      <w:r>
+        <w:t>,</w:t>
+      </w:r>
+      <w:r>
+        <w:tab/>
+      </w:r>
+      <w:r>
+        <w:t xml:space="preserve"> </w:t>
+      </w:r>
+      <w:r>
+        <w:rPr>
+          <w:i/>
+          <w:iCs/>
+          <w:color w:val="767171" w:themeColor="background2" w:themeShade="80"/>
+        </w:rPr>
+        <w:t>– az OEE összesített értéke az adott időablakra</w:t>
+      </w:r>
+    </w:p>
+    <w:p>
+      <w:pPr>
+        <w:pStyle w:val="Listaszerbekezds"/>
+        <w:numPr>
+          <w:ilvl w:val="0"/>
+          <w:numId w:val="16"/>
+        </w:numPr>
+      </w:pPr>
+      <w:proofErr w:type="spellStart"/>
+      <w:r>
+        <w:rPr>
+          <w:rFonts w:ascii="Consolas" w:hAnsi="Consolas"/>
+          <w:b/>
+          <w:bCs/>
+          <w:color w:val="0070C0"/>
+          <w:sz w:val="20"/>
+          <w:szCs w:val="20"/>
+        </w:rPr>
+        <w:t>good_parts</w:t>
+      </w:r>
+      <w:proofErr w:type="spellEnd"/>
+      <w:r>
+        <w:t>,</w:t>
+      </w:r>
+      <w:r>
+        <w:tab/>
+        <w:t xml:space="preserve"> </w:t>
+      </w:r>
+      <w:r>
+        <w:rPr>
+          <w:i/>
+          <w:iCs/>
+          <w:color w:val="767171" w:themeColor="background2" w:themeShade="80"/>
+        </w:rPr>
+        <w:t>– a jó darabok száma az adott időablakban</w:t>
+      </w:r>
+    </w:p>
+    <w:p>
+      <w:pPr>
+        <w:pStyle w:val="Listaszerbekezds"/>
+        <w:numPr>
+          <w:ilvl w:val="0"/>
+          <w:numId w:val="16"/>
+        </w:numPr>
+      </w:pPr>
+      <w:proofErr w:type="spellStart"/>
+      <w:r>
+        <w:rPr>
+          <w:rFonts w:ascii="Consolas" w:hAnsi="Consolas"/>
+          <w:b/>
+          <w:bCs/>
+          <w:color w:val="0070C0"/>
+          <w:sz w:val="20"/>
+          <w:szCs w:val="20"/>
+        </w:rPr>
+        <w:t>total_parts</w:t>
+      </w:r>
+      <w:proofErr w:type="spellEnd"/>
+      <w:r>
+        <w:t>,</w:t>
+      </w:r>
+      <w:r>
+        <w:tab/>
+        <w:t xml:space="preserve"> </w:t>
+      </w:r>
+      <w:r>
+        <w:rPr>
+          <w:i/>
+          <w:iCs/>
+          <w:color w:val="767171" w:themeColor="background2" w:themeShade="80"/>
+        </w:rPr>
+        <w:t>– az összes legyártott darab száma az adott időablakban</w:t>
+      </w:r>
+    </w:p>
+    <w:p>
+      <w:pPr>
+        <w:pStyle w:val="Listaszerbekezds"/>
+        <w:numPr>
+          <w:ilvl w:val="0"/>
+          <w:numId w:val="16"/>
+        </w:numPr>
+      </w:pPr>
+      <w:proofErr w:type="spellStart"/>
+      <w:r>
+        <w:rPr>
+          <w:rFonts w:ascii="Consolas" w:hAnsi="Consolas"/>
+          <w:b/>
+          <w:bCs/>
+          <w:color w:val="0070C0"/>
+          <w:sz w:val="20"/>
+          <w:szCs w:val="20"/>
+        </w:rPr>
+        <w:t>scrap_parts</w:t>
+      </w:r>
+      <w:proofErr w:type="spellEnd"/>
+      <w:r>
+        <w:t>,</w:t>
+      </w:r>
+      <w:r>
+        <w:t xml:space="preserve"> </w:t>
+      </w:r>
+      <w:r>
+        <w:tab/>
+      </w:r>
+      <w:r>
+        <w:rPr>
+          <w:i/>
+          <w:iCs/>
+          <w:color w:val="767171" w:themeColor="background2" w:themeShade="80"/>
+        </w:rPr>
+        <w:t>– a selejt darabok száma az adott időablakban</w:t>
+      </w:r>
+    </w:p>
+    <w:p>
+      <w:pPr>
+        <w:pStyle w:val="Listaszerbekezds"/>
+        <w:numPr>
+          <w:ilvl w:val="0"/>
+          <w:numId w:val="16"/>
+        </w:numPr>
+      </w:pPr>
+      <w:proofErr w:type="spellStart"/>
+      <w:r>
+        <w:rPr>
+          <w:rFonts w:ascii="Consolas" w:hAnsi="Consolas"/>
+          <w:b/>
+          <w:bCs/>
+          <w:color w:val="0070C0"/>
+          <w:sz w:val="20"/>
+          <w:szCs w:val="20"/>
+        </w:rPr>
+        <w:t>scrap_rate</w:t>
+      </w:r>
+      <w:proofErr w:type="spellEnd"/>
+      <w:r>
+        <w:t>,</w:t>
+      </w:r>
+      <w:r>
+        <w:t xml:space="preserve"> </w:t>
+      </w:r>
+      <w:r>
+        <w:tab/>
+      </w:r>
+      <w:r>
+        <w:rPr>
+          <w:i/>
+          <w:iCs/>
+          <w:color w:val="767171" w:themeColor="background2" w:themeShade="80"/>
+        </w:rPr>
+        <w:t>– a selejt darabok aránya az összes darabszámon belül</w:t>
+      </w:r>
+    </w:p>
+    <w:p>
+      <w:pPr>
+        <w:pStyle w:val="Listaszerbekezds"/>
+        <w:numPr>
+          <w:ilvl w:val="0"/>
+          <w:numId w:val="16"/>
+        </w:numPr>
+      </w:pPr>
+      <w:proofErr w:type="spellStart"/>
+      <w:r>
+        <w:rPr>
+          <w:rFonts w:ascii="Consolas" w:hAnsi="Consolas"/>
+          <w:b/>
+          <w:bCs/>
+          <w:color w:val="0070C0"/>
+          <w:sz w:val="20"/>
+          <w:szCs w:val="20"/>
+        </w:rPr>
+        <w:t>energy_total_kwh</w:t>
+      </w:r>
+      <w:proofErr w:type="spellEnd"/>
+      <w:r>
+        <w:t>,</w:t>
+      </w:r>
+      <w:r>
+        <w:t xml:space="preserve"> </w:t>
+      </w:r>
+      <w:r>
+        <w:tab/>
+      </w:r>
+      <w:r>
+        <w:rPr>
+          <w:i/>
+          <w:iCs/>
+          <w:color w:val="767171" w:themeColor="background2" w:themeShade="80"/>
+        </w:rPr>
+        <w:t>– az adott időablak teljes energiafogyasztása</w:t>
+      </w:r>
+    </w:p>
+    <w:p>
+      <w:pPr>
+        <w:pStyle w:val="Listaszerbekezds"/>
+        <w:numPr>
+          <w:ilvl w:val="0"/>
+          <w:numId w:val="16"/>
+        </w:numPr>
+      </w:pPr>
+      <w:proofErr w:type="spellStart"/>
+      <w:r>
+        <w:rPr>
+          <w:rFonts w:ascii="Consolas" w:hAnsi="Consolas"/>
+          <w:b/>
+          <w:bCs/>
+          <w:color w:val="0070C0"/>
+          <w:sz w:val="20"/>
+          <w:szCs w:val="20"/>
+        </w:rPr>
+        <w:t>cycle_energy_per_good_part_kwh</w:t>
+      </w:r>
+      <w:proofErr w:type="spellEnd"/>
+      <w:r>
+        <w:t>,</w:t>
+      </w:r>
+      <w:r>
+        <w:t xml:space="preserve"> </w:t>
+      </w:r>
+      <w:r>
+        <w:tab/>
+      </w:r>
+      <w:r>
+        <w:rPr>
+          <w:i/>
+          <w:iCs/>
+          <w:color w:val="767171" w:themeColor="background2" w:themeShade="80"/>
+        </w:rPr>
+        <w:t>– ciklusalapú energiafogyasztás egy jó darabra vetítve</w:t>
+      </w:r>
+    </w:p>
+    <w:p>
+      <w:pPr>
+        <w:pStyle w:val="Listaszerbekezds"/>
+        <w:numPr>
+          <w:ilvl w:val="0"/>
+          <w:numId w:val="16"/>
+        </w:numPr>
+      </w:pPr>
+      <w:proofErr w:type="spellStart"/>
+      <w:r>
+        <w:rPr>
+          <w:rFonts w:ascii="Consolas" w:hAnsi="Consolas"/>
+          <w:b/>
+          <w:bCs/>
+          <w:color w:val="0070C0"/>
+          <w:sz w:val="20"/>
+          <w:szCs w:val="20"/>
+        </w:rPr>
+        <w:t>system_energy_per_good_part_kwh</w:t>
+      </w:r>
+      <w:proofErr w:type="spellEnd"/>
+      <w:r>
+        <w:t>,</w:t>
+      </w:r>
+      <w:r>
+        <w:t xml:space="preserve"> </w:t>
+      </w:r>
+      <w:r>
+        <w:tab/>
+      </w:r>
+      <w:r>
+        <w:rPr>
+          <w:i/>
+          <w:iCs/>
+          <w:color w:val="767171" w:themeColor="background2" w:themeShade="80"/>
+        </w:rPr>
+        <w:t>– teljes rendszerenergia-fogyasztás egy jó darabra vetítve</w:t>
+      </w:r>
+    </w:p>
+    <w:p>
+      <w:pPr>
+        <w:pStyle w:val="Listaszerbekezds"/>
+        <w:numPr>
+          <w:ilvl w:val="0"/>
+          <w:numId w:val="16"/>
+        </w:numPr>
+      </w:pPr>
+      <w:proofErr w:type="spellStart"/>
+      <w:r>
+        <w:rPr>
+          <w:rFonts w:ascii="Consolas" w:hAnsi="Consolas"/>
+          <w:b/>
+          <w:bCs/>
+          <w:color w:val="0070C0"/>
+          <w:sz w:val="20"/>
+          <w:szCs w:val="20"/>
+        </w:rPr>
+        <w:t>non_productive_energy_ratio</w:t>
+      </w:r>
+      <w:proofErr w:type="spellEnd"/>
+      <w:r>
+        <w:t>.</w:t>
+      </w:r>
+      <w:r>
+        <w:t xml:space="preserve"> </w:t>
+      </w:r>
+      <w:r>
+        <w:tab/>
+      </w:r>
+      <w:r>
+        <w:rPr>
+          <w:i/>
+          <w:iCs/>
+          <w:color w:val="767171" w:themeColor="background2" w:themeShade="80"/>
+        </w:rPr>
+        <w:t>– a nem termelő energia aránya az összes energiafogyasztáson belül</w:t>
+      </w:r>
+    </w:p>
+    <w:p>
+      <w:r>
+        <w:t xml:space="preserve">A regresszió futtatása előtt ki kell zárni azokat a megfigyeléseket, ahol </w:t>
+      </w:r>
+      <w:proofErr w:type="spellStart"/>
+      <w:r>
+        <w:rPr>
+          <w:rFonts w:ascii="Consolas" w:hAnsi="Consolas"/>
+          <w:b/>
+          <w:bCs/>
+          <w:color w:val="0070C0"/>
+          <w:sz w:val="20"/>
+          <w:szCs w:val="20"/>
+        </w:rPr>
+        <w:t>good_parts</w:t>
+      </w:r>
+      <w:proofErr w:type="spellEnd"/>
+      <w:r>
+        <w:t xml:space="preserve"> </w:t>
+      </w:r>
+      <w:r>
+        <w:rPr>
+          <w:b/>
+          <w:bCs/>
+        </w:rPr>
+        <w:t>= 0</w:t>
+      </w:r>
+      <w:r>
+        <w:t xml:space="preserve">, mivel ezekben az esetekben az egy jó darabra jutó energiafogyasztás nem értelmezhető. </w:t>
+      </w:r>
+      <w:r>
+        <w:t xml:space="preserve">Ezen felül a minimálisan elfogadott jó darabszámot is célszerű </w:t>
+      </w:r>
+      <w:proofErr w:type="spellStart"/>
+      <w:r>
+        <w:t>paraméterezhetővé</w:t>
+      </w:r>
+      <w:proofErr w:type="spellEnd"/>
+      <w:r>
+        <w:t xml:space="preserve"> tenni egy konfigurációs fájlban. Például bevezethető egy </w:t>
+      </w:r>
+      <w:proofErr w:type="spellStart"/>
+      <w:r>
+        <w:rPr>
+          <w:b/>
+          <w:bCs/>
+        </w:rPr>
+        <w:t>min_good_parts_for_regression</w:t>
+      </w:r>
+      <w:proofErr w:type="spellEnd"/>
+      <w:r>
+        <w:t xml:space="preserve"> paraméter, amelynek alapértelmezett értéke 2. Így a szűrési küszöb később egyszerűen módosítható, és a modell érzékenysége több beállítás mellett is vizsgálható.</w:t>
+      </w:r>
+      <w:r>
+        <w:t xml:space="preserve"> </w:t>
+      </w:r>
+    </w:p>
+    <w:p>
+      <w:pPr>
+        <w:rPr>
+          <w:b/>
+          <w:bCs/>
+          <w:color w:val="002060"/>
+          <w:sz w:val="24"/>
+          <w:szCs w:val="24"/>
+        </w:rPr>
+      </w:pPr>
+      <w:r>
+        <w:rPr>
+          <w:b/>
+          <w:bCs/>
+          <w:color w:val="002060"/>
+          <w:sz w:val="24"/>
+          <w:szCs w:val="24"/>
+        </w:rPr>
+        <w:t>5.5. A modellvalidáció szempontjai</w:t>
+      </w:r>
+    </w:p>
+    <w:p>
+      <w:pPr>
+        <w:spacing w:before="100" w:beforeAutospacing="1" w:after="100" w:afterAutospacing="1" w:line="240" w:lineRule="auto"/>
+      </w:pPr>
+      <w:r>
+        <w:t xml:space="preserve">A regressziós modell értékelésének célja nem pusztán egy illesztett egyenlet előállítása, hanem annak megállapítása is, hogy a kapott kapcsolat </w:t>
+      </w:r>
+      <w:proofErr w:type="spellStart"/>
+      <w:r>
+        <w:t>statisztikailag</w:t>
+      </w:r>
+      <w:proofErr w:type="spellEnd"/>
+      <w:r>
+        <w:t xml:space="preserve"> értelmezhető és módszertanilag védhető legyen. Ennek megfelelően a validáció során az alábbi szempontokat célszerű vizsgálni:</w:t>
+      </w:r>
+    </w:p>
+    <w:p>
+      <w:pPr>
+        <w:numPr>
+          <w:ilvl w:val="0"/>
+          <w:numId w:val="17"/>
+        </w:numPr>
+        <w:spacing w:before="100" w:beforeAutospacing="1" w:after="100" w:afterAutospacing="1" w:line="240" w:lineRule="auto"/>
+      </w:pPr>
+      <w:r>
+        <w:t xml:space="preserve">az együtthatók előjele és nagysága, </w:t>
+      </w:r>
+    </w:p>
+    <w:p>
+      <w:pPr>
+        <w:numPr>
+          <w:ilvl w:val="0"/>
+          <w:numId w:val="17"/>
+        </w:numPr>
+        <w:spacing w:before="100" w:beforeAutospacing="1" w:after="100" w:afterAutospacing="1" w:line="240" w:lineRule="auto"/>
+      </w:pPr>
+      <w:r>
+        <w:t xml:space="preserve">a paraméterek statisztikai szignifikanciája, </w:t>
+      </w:r>
+    </w:p>
+    <w:p>
+      <w:pPr>
+        <w:numPr>
+          <w:ilvl w:val="0"/>
+          <w:numId w:val="17"/>
+        </w:numPr>
+        <w:spacing w:before="100" w:beforeAutospacing="1" w:after="100" w:afterAutospacing="1" w:line="240" w:lineRule="auto"/>
+      </w:pPr>
+      <w:r>
+        <w:t xml:space="preserve">a modell magyarázóereje, </w:t>
+      </w:r>
+    </w:p>
+    <w:p>
+      <w:pPr>
+        <w:numPr>
+          <w:ilvl w:val="0"/>
+          <w:numId w:val="17"/>
+        </w:numPr>
+        <w:spacing w:before="100" w:beforeAutospacing="1" w:after="100" w:afterAutospacing="1" w:line="240" w:lineRule="auto"/>
+      </w:pPr>
+      <w:r>
+        <w:t xml:space="preserve">a </w:t>
+      </w:r>
+      <w:proofErr w:type="spellStart"/>
+      <w:r>
+        <w:t>multikollinearitás</w:t>
+      </w:r>
+      <w:proofErr w:type="spellEnd"/>
+      <w:r>
+        <w:t xml:space="preserve"> mértéke VIF segítségével, </w:t>
+      </w:r>
+    </w:p>
+    <w:p>
+      <w:pPr>
+        <w:numPr>
+          <w:ilvl w:val="0"/>
+          <w:numId w:val="17"/>
+        </w:numPr>
+        <w:spacing w:before="100" w:beforeAutospacing="1" w:after="100" w:afterAutospacing="1" w:line="240" w:lineRule="auto"/>
+      </w:pPr>
+      <w:r>
+        <w:t xml:space="preserve">a </w:t>
+      </w:r>
+      <w:proofErr w:type="spellStart"/>
+      <w:r>
+        <w:t>heteroszkedaszticitás</w:t>
+      </w:r>
+      <w:proofErr w:type="spellEnd"/>
+      <w:r>
+        <w:t xml:space="preserve"> vizsgálata, például </w:t>
+      </w:r>
+      <w:proofErr w:type="spellStart"/>
+      <w:r>
+        <w:t>Breusch</w:t>
+      </w:r>
+      <w:proofErr w:type="spellEnd"/>
+      <w:r>
+        <w:t>–</w:t>
+      </w:r>
+      <w:proofErr w:type="spellStart"/>
+      <w:r>
+        <w:t>Pagan</w:t>
+      </w:r>
+      <w:proofErr w:type="spellEnd"/>
+      <w:r>
+        <w:t xml:space="preserve"> teszttel, </w:t>
+      </w:r>
+    </w:p>
+    <w:p>
+      <w:pPr>
+        <w:numPr>
+          <w:ilvl w:val="0"/>
+          <w:numId w:val="17"/>
+        </w:numPr>
+        <w:spacing w:before="100" w:beforeAutospacing="1" w:after="100" w:afterAutospacing="1" w:line="240" w:lineRule="auto"/>
+      </w:pPr>
+      <w:r>
+        <w:t xml:space="preserve">a </w:t>
+      </w:r>
+      <w:proofErr w:type="spellStart"/>
+      <w:r>
+        <w:t>reziduumok</w:t>
+      </w:r>
+      <w:proofErr w:type="spellEnd"/>
+      <w:r>
+        <w:t xml:space="preserve"> viselkedésének vizuális ellenőrzése </w:t>
+      </w:r>
+      <w:proofErr w:type="spellStart"/>
+      <w:r>
+        <w:t>reziduum-plot</w:t>
+      </w:r>
+      <w:proofErr w:type="spellEnd"/>
+      <w:r>
+        <w:t xml:space="preserve"> és QQ-</w:t>
+      </w:r>
+      <w:proofErr w:type="spellStart"/>
+      <w:r>
+        <w:t>plot</w:t>
+      </w:r>
+      <w:proofErr w:type="spellEnd"/>
+      <w:r>
+        <w:t xml:space="preserve"> segítségével, </w:t>
+      </w:r>
+    </w:p>
+    <w:p>
+      <w:pPr>
+        <w:numPr>
+          <w:ilvl w:val="0"/>
+          <w:numId w:val="17"/>
+        </w:numPr>
+        <w:spacing w:before="100" w:beforeAutospacing="1" w:after="100" w:afterAutospacing="1" w:line="240" w:lineRule="auto"/>
+      </w:pPr>
+      <w:r>
+        <w:t xml:space="preserve">valamint a GLM esetén a </w:t>
+      </w:r>
+      <w:proofErr w:type="spellStart"/>
+      <w:r>
+        <w:t>deviance</w:t>
+      </w:r>
+      <w:proofErr w:type="spellEnd"/>
+      <w:r>
+        <w:t xml:space="preserve"> és az információs kritériumok értelmezése. </w:t>
+      </w:r>
+    </w:p>
+    <w:p>
+      <w:pPr>
+        <w:spacing w:before="100" w:beforeAutospacing="1" w:after="100" w:afterAutospacing="1" w:line="240" w:lineRule="auto"/>
+      </w:pPr>
+      <w:r>
+        <w:t>A validáció célja annak eldöntése, hogy a modell valóban az OEE-komponensek és az energiaintenzitás kapcsolatát írja-e le, vagy az eredményeket inkább adatminőségi, mintaméretbeli vagy strukturális problémák torzítják.</w:t>
+      </w:r>
+    </w:p>
+    <w:p>
+      <w:pPr>
+        <w:rPr>
+          <w:b/>
+          <w:bCs/>
+          <w:color w:val="002060"/>
+          <w:sz w:val="24"/>
+          <w:szCs w:val="24"/>
+        </w:rPr>
+      </w:pPr>
+      <w:r>
+        <w:rPr>
+          <w:b/>
+          <w:bCs/>
+          <w:color w:val="002060"/>
+          <w:sz w:val="24"/>
+          <w:szCs w:val="24"/>
+        </w:rPr>
+        <w:t>5.6. Szenzitivitási elemzés</w:t>
+      </w:r>
+    </w:p>
+    <w:p>
+      <w:pPr>
+        <w:spacing w:before="100" w:beforeAutospacing="1" w:after="100" w:afterAutospacing="1" w:line="240" w:lineRule="auto"/>
+      </w:pPr>
+      <w:r>
+        <w:t>A regresszió egyik legfontosabb gyakorlati hozadéka a szenzitivitási elemzés. Ennek célja annak meghatározása, hogy az OEE egyes komponenseinek javítása milyen mértékben csökkentheti az energiaintenzitást. A log linkkel vagy log-transzformációval becsült modellek esetén egy 1 százalékpontos javulás hatása az együtthatók alapján közvetlenül becsülhető.</w:t>
+      </w:r>
+    </w:p>
+    <w:p>
+      <w:pPr>
+        <w:spacing w:before="100" w:beforeAutospacing="1" w:after="100" w:afterAutospacing="1" w:line="240" w:lineRule="auto"/>
+      </w:pPr>
+      <w:r>
+        <w:t xml:space="preserve">A szenzitivitási elemzés során minden komponensre külön meghatározható, hogy 1 százalékpontos javulás mekkora várható relatív változást okoz a célváltozóban. Ennek alapján az </w:t>
+      </w:r>
+      <w:proofErr w:type="spellStart"/>
+      <w:r>
+        <w:t>Availability</w:t>
+      </w:r>
+      <w:proofErr w:type="spellEnd"/>
+      <w:r>
+        <w:t xml:space="preserve">, Performance és </w:t>
+      </w:r>
+      <w:proofErr w:type="spellStart"/>
+      <w:r>
+        <w:t>Quality</w:t>
+      </w:r>
+      <w:proofErr w:type="spellEnd"/>
+      <w:r>
+        <w:t xml:space="preserve"> komponensek rangsorolhatók energiahatékonysági potenciál szerint.</w:t>
+      </w:r>
+    </w:p>
+    <w:p>
+      <w:pPr>
+        <w:spacing w:before="100" w:beforeAutospacing="1" w:after="100" w:afterAutospacing="1" w:line="240" w:lineRule="auto"/>
+      </w:pPr>
+      <w:r>
+        <w:t xml:space="preserve">A várakozás a korábbi energetikai értelmezés alapján az, hogy ha a célváltozó a ciklusalapú energia/jó darab, akkor a Performance hatása lesz erősebb, mivel ez közvetlenebbül kapcsolódik a ciklusokhoz. Ha viszont a célváltozó a rendszerenergia/jó darab, akkor az </w:t>
+      </w:r>
+      <w:proofErr w:type="spellStart"/>
+      <w:r>
+        <w:t>Availability</w:t>
+      </w:r>
+      <w:proofErr w:type="spellEnd"/>
+      <w:r>
+        <w:t xml:space="preserve"> és a </w:t>
+      </w:r>
+      <w:proofErr w:type="spellStart"/>
+      <w:r>
+        <w:t>Quality</w:t>
+      </w:r>
+      <w:proofErr w:type="spellEnd"/>
+      <w:r>
+        <w:t xml:space="preserve"> szerepe hangsúlyosabban jelenhet meg, mert ezek a nem termelő energia és a selejthez kapcsolódó veszteségek hatását is jobban tükrözik.</w:t>
+      </w:r>
+    </w:p>
+    <w:p>
+      <w:pPr>
+        <w:spacing w:before="100" w:beforeAutospacing="1" w:after="100" w:afterAutospacing="1" w:line="240" w:lineRule="auto"/>
+      </w:pPr>
+    </w:p>
+    <w:p>
+      <w:pPr>
+        <w:rPr>
+          <w:b/>
+          <w:bCs/>
+          <w:color w:val="002060"/>
+          <w:sz w:val="24"/>
+          <w:szCs w:val="24"/>
+        </w:rPr>
+      </w:pPr>
+      <w:r>
+        <w:rPr>
+          <w:b/>
+          <w:bCs/>
+          <w:color w:val="002060"/>
+          <w:sz w:val="24"/>
+          <w:szCs w:val="24"/>
+        </w:rPr>
+        <w:lastRenderedPageBreak/>
+        <w:t xml:space="preserve">5.7. </w:t>
+      </w:r>
+      <w:r>
+        <w:rPr>
+          <w:b/>
+          <w:bCs/>
+          <w:color w:val="002060"/>
+          <w:sz w:val="24"/>
+          <w:szCs w:val="24"/>
+        </w:rPr>
+        <w:t>A regressziós eredmények felhasználóbarát értelmezése nagy nyelvi modellel</w:t>
+      </w:r>
+    </w:p>
+    <w:p>
+      <w:r>
+        <w:t xml:space="preserve">A regressziós modell egyik fontos gyakorlati kérdése nemcsak az, hogy a kapcsolat </w:t>
+      </w:r>
+      <w:proofErr w:type="spellStart"/>
+      <w:r>
+        <w:t>statisztikailag</w:t>
+      </w:r>
+      <w:proofErr w:type="spellEnd"/>
+      <w:r>
+        <w:t xml:space="preserve"> kimutatható-e, hanem az is, hogy az eredmények mennyire tehetők érthetővé a végfelhasználó számára. A regressziós együtthatók, szignifikanciaszintek, illeszkedési mutatók és szenzitivitási eredmények önmagukban szakmailag értelmezhetők, azonban közvetlen formában nem minden esetben alkalmasak arra, hogy felhasználóbarát módon jelenjenek meg egy </w:t>
+      </w:r>
+      <w:proofErr w:type="spellStart"/>
+      <w:r>
+        <w:t>dashboardon</w:t>
+      </w:r>
+      <w:proofErr w:type="spellEnd"/>
+      <w:r>
+        <w:t xml:space="preserve"> vagy döntéstámogató felületen.</w:t>
+      </w:r>
+    </w:p>
+    <w:p>
+      <w:r>
+        <w:t>Ezért a jelen projektben célszerűbb egy nagy nyelvi modellre épülő értelmezési réteg kialakítása. Ennek lényege, hogy a regressziós modell strukturált kimenete</w:t>
+      </w:r>
+      <w:r>
+        <w:t xml:space="preserve">, </w:t>
+      </w:r>
+      <w:r>
+        <w:t>például a modell típusa, a célváltozó neve, a becsült együtthatók, azok előjele, szignifikanciaszintje, a magyarázó változók neve, valamint az illeszkedési mutatók</w:t>
+      </w:r>
+      <w:r>
+        <w:t xml:space="preserve">, </w:t>
+      </w:r>
+      <w:r>
+        <w:t>egy előre definiált prompt formájában átadható egy nagy nyelvi modellnek. A nyelvi modell feladata ezután az, hogy az eredményeket felhasználóbarát, természetes nyelvű magyarázattá alakítsa.</w:t>
+      </w:r>
+    </w:p>
+    <w:p>
+      <w:r>
+        <w:t xml:space="preserve">A módszer előnye, hogy az értelmezési réteg rugalmasabbá válik, mint egy merev sablonrendszer esetén. Ugyanaz a megközelítés alkalmazható különböző regressziós modellekre, eltérő célváltozókra és különböző </w:t>
+      </w:r>
+      <w:proofErr w:type="spellStart"/>
+      <w:r>
+        <w:t>aggregációs</w:t>
+      </w:r>
+      <w:proofErr w:type="spellEnd"/>
+      <w:r>
+        <w:t xml:space="preserve"> szintekre is, miközben a felhasználó számára továbbra is rövid, érthető és szakmailag releváns szöveges kimenet jelenik meg.</w:t>
+      </w:r>
+    </w:p>
+    <w:p>
+      <w:r>
+        <w:t xml:space="preserve">A regressziós eredmények értelmezésére szolgáló </w:t>
+      </w:r>
+      <w:proofErr w:type="spellStart"/>
+      <w:r>
+        <w:t>promptnak</w:t>
+      </w:r>
+      <w:proofErr w:type="spellEnd"/>
+      <w:r>
+        <w:t xml:space="preserve"> célszerű tartalmaznia legalább az alábbi információkat:</w:t>
+      </w:r>
+    </w:p>
+    <w:p>
+      <w:pPr>
+        <w:pStyle w:val="Listaszerbekezds"/>
+        <w:numPr>
+          <w:ilvl w:val="0"/>
+          <w:numId w:val="21"/>
+        </w:numPr>
+      </w:pPr>
+      <w:r>
+        <w:t>a modell típusát,</w:t>
+      </w:r>
+    </w:p>
+    <w:p>
+      <w:pPr>
+        <w:pStyle w:val="Listaszerbekezds"/>
+        <w:numPr>
+          <w:ilvl w:val="0"/>
+          <w:numId w:val="21"/>
+        </w:numPr>
+      </w:pPr>
+      <w:r>
+        <w:t>a célváltozót,</w:t>
+      </w:r>
+    </w:p>
+    <w:p>
+      <w:pPr>
+        <w:pStyle w:val="Listaszerbekezds"/>
+        <w:numPr>
+          <w:ilvl w:val="0"/>
+          <w:numId w:val="21"/>
+        </w:numPr>
+      </w:pPr>
+      <w:r>
+        <w:t>a magyarázó változókat,</w:t>
+      </w:r>
+    </w:p>
+    <w:p>
+      <w:pPr>
+        <w:pStyle w:val="Listaszerbekezds"/>
+        <w:numPr>
+          <w:ilvl w:val="0"/>
+          <w:numId w:val="21"/>
+        </w:numPr>
+      </w:pPr>
+      <w:r>
+        <w:t>az együtthatók értékét és előjelét,</w:t>
+      </w:r>
+    </w:p>
+    <w:p>
+      <w:pPr>
+        <w:pStyle w:val="Listaszerbekezds"/>
+        <w:numPr>
+          <w:ilvl w:val="0"/>
+          <w:numId w:val="21"/>
+        </w:numPr>
+      </w:pPr>
+      <w:r>
+        <w:t>a szignifikanciaszinteket,</w:t>
+      </w:r>
+    </w:p>
+    <w:p>
+      <w:pPr>
+        <w:pStyle w:val="Listaszerbekezds"/>
+        <w:numPr>
+          <w:ilvl w:val="0"/>
+          <w:numId w:val="21"/>
+        </w:numPr>
+      </w:pPr>
+      <w:r>
+        <w:t>az illeszkedésre vonatkozó főbb mutatókat,</w:t>
+      </w:r>
+    </w:p>
+    <w:p>
+      <w:pPr>
+        <w:pStyle w:val="Listaszerbekezds"/>
+        <w:numPr>
+          <w:ilvl w:val="0"/>
+          <w:numId w:val="21"/>
+        </w:numPr>
+      </w:pPr>
+      <w:r>
+        <w:t>valamint azt a kontextust, hogy a modell ciklusalapú vagy rendszer szintű energiaintenzitási mutatóra készült.</w:t>
+      </w:r>
+    </w:p>
+    <w:p>
+      <w:r>
+        <w:t xml:space="preserve">Ez azért fontos, mert ugyanazon regressziós eredmény eltérő értelmezést kívánhat attól függően, hogy a célváltozó a </w:t>
+      </w:r>
+      <w:proofErr w:type="spellStart"/>
+      <w:r>
+        <w:rPr>
+          <w:rFonts w:ascii="Consolas" w:hAnsi="Consolas"/>
+          <w:b/>
+          <w:bCs/>
+          <w:color w:val="0070C0"/>
+          <w:sz w:val="20"/>
+          <w:szCs w:val="20"/>
+        </w:rPr>
+        <w:t>cycle_energy_per_good_part_kwh</w:t>
+      </w:r>
+      <w:proofErr w:type="spellEnd"/>
+      <w:r>
+        <w:t xml:space="preserve"> vagy a </w:t>
+      </w:r>
+      <w:proofErr w:type="spellStart"/>
+      <w:r>
+        <w:rPr>
+          <w:rFonts w:ascii="Consolas" w:hAnsi="Consolas"/>
+          <w:b/>
+          <w:bCs/>
+          <w:color w:val="0070C0"/>
+          <w:sz w:val="20"/>
+          <w:szCs w:val="20"/>
+        </w:rPr>
+        <w:t>system_energy_per_good_part_kwh</w:t>
+      </w:r>
+      <w:proofErr w:type="spellEnd"/>
+      <w:r>
+        <w:t>. A nyelvi modell így nem pusztán számszerű eredményeket fogalmaz át, hanem a projekt kontextusában értelmezett következtetést is képes adni.</w:t>
+      </w:r>
+    </w:p>
+    <w:p>
+      <w:pPr>
+        <w:rPr>
+          <w:b/>
+          <w:bCs/>
+          <w:color w:val="002060"/>
+          <w:sz w:val="24"/>
+          <w:szCs w:val="24"/>
+        </w:rPr>
+      </w:pPr>
+    </w:p>
+    <w:p>
+      <w:pPr>
+        <w:rPr>
+          <w:b/>
+          <w:bCs/>
+          <w:color w:val="002060"/>
+          <w:sz w:val="24"/>
+          <w:szCs w:val="24"/>
+        </w:rPr>
+      </w:pPr>
+      <w:r>
+        <w:rPr>
+          <w:b/>
+          <w:bCs/>
+          <w:color w:val="002060"/>
+          <w:sz w:val="24"/>
+          <w:szCs w:val="24"/>
+        </w:rPr>
+        <w:t>5.</w:t>
+      </w:r>
+      <w:r>
+        <w:rPr>
+          <w:b/>
+          <w:bCs/>
+          <w:color w:val="002060"/>
+          <w:sz w:val="24"/>
+          <w:szCs w:val="24"/>
+        </w:rPr>
+        <w:t>8</w:t>
+      </w:r>
+      <w:r>
+        <w:rPr>
+          <w:b/>
+          <w:bCs/>
+          <w:color w:val="002060"/>
+          <w:sz w:val="24"/>
+          <w:szCs w:val="24"/>
+        </w:rPr>
+        <w:t>. A megvalósítási sorrend</w:t>
+      </w:r>
+    </w:p>
+    <w:p>
+      <w:pPr>
+        <w:spacing w:before="100" w:beforeAutospacing="1" w:after="100" w:afterAutospacing="1" w:line="240" w:lineRule="auto"/>
+      </w:pPr>
+      <w:r>
+        <w:t>A regressziós blokk gyakorlati megvalósításához a következő sorrend javasolt:</w:t>
+      </w:r>
+    </w:p>
+    <w:p>
+      <w:pPr>
+        <w:pStyle w:val="Listaszerbekezds"/>
+        <w:numPr>
+          <w:ilvl w:val="0"/>
+          <w:numId w:val="20"/>
+        </w:numPr>
+      </w:pPr>
+      <w:r>
+        <w:t xml:space="preserve">a regressziós konfigurációs paraméterek rögzítése, különösen az </w:t>
+      </w:r>
+      <w:proofErr w:type="spellStart"/>
+      <w:r>
+        <w:t>aggregációs</w:t>
+      </w:r>
+      <w:proofErr w:type="spellEnd"/>
+      <w:r>
+        <w:t xml:space="preserve"> szint és a minimális jó darabszám küszöbének meghatározása,</w:t>
+      </w:r>
+    </w:p>
+    <w:p>
+      <w:pPr>
+        <w:pStyle w:val="Listaszerbekezds"/>
+        <w:numPr>
+          <w:ilvl w:val="0"/>
+          <w:numId w:val="20"/>
+        </w:numPr>
+      </w:pPr>
+      <w:r>
+        <w:t>regresszióhoz előkészítő aggregált inputnézet létrehozása,</w:t>
+      </w:r>
+    </w:p>
+    <w:p>
+      <w:pPr>
+        <w:pStyle w:val="Listaszerbekezds"/>
+        <w:numPr>
+          <w:ilvl w:val="0"/>
+          <w:numId w:val="20"/>
+        </w:numPr>
+      </w:pPr>
+      <w:r>
+        <w:t>a célváltozó és a magyarázó változók eloszlásának feltáró elemzése,</w:t>
+      </w:r>
+    </w:p>
+    <w:p>
+      <w:pPr>
+        <w:pStyle w:val="Listaszerbekezds"/>
+        <w:numPr>
+          <w:ilvl w:val="0"/>
+          <w:numId w:val="20"/>
+        </w:numPr>
+      </w:pPr>
+      <w:r>
+        <w:t>log-transzformált OLS kontrollmodell illesztése,</w:t>
+      </w:r>
+    </w:p>
+    <w:p>
+      <w:pPr>
+        <w:pStyle w:val="Listaszerbekezds"/>
+        <w:numPr>
+          <w:ilvl w:val="0"/>
+          <w:numId w:val="20"/>
+        </w:numPr>
+      </w:pPr>
+      <w:r>
+        <w:t>Gamma GLM főmodell illesztése,</w:t>
+      </w:r>
+    </w:p>
+    <w:p>
+      <w:pPr>
+        <w:pStyle w:val="Listaszerbekezds"/>
+        <w:numPr>
+          <w:ilvl w:val="0"/>
+          <w:numId w:val="20"/>
+        </w:numPr>
+      </w:pPr>
+      <w:r>
+        <w:t>az elsődleges és a másodlagos célváltozóra kapott modellek összevetése,</w:t>
+      </w:r>
+    </w:p>
+    <w:p>
+      <w:pPr>
+        <w:pStyle w:val="Listaszerbekezds"/>
+        <w:numPr>
+          <w:ilvl w:val="0"/>
+          <w:numId w:val="20"/>
+        </w:numPr>
+      </w:pPr>
+      <w:r>
+        <w:t>szenzitivitási rangsor készítése az OEE komponensekre.</w:t>
+      </w:r>
+    </w:p>
+    <w:p>
+      <w:pPr>
+        <w:pStyle w:val="Listaszerbekezds"/>
+        <w:numPr>
+          <w:ilvl w:val="0"/>
+          <w:numId w:val="20"/>
+        </w:numPr>
+      </w:pPr>
+      <w:r>
+        <w:t>a regressziós eredmények strukturált kimenetének előállítása, például táblás vagy JSON formában,</w:t>
+      </w:r>
+    </w:p>
+    <w:p>
+      <w:pPr>
+        <w:pStyle w:val="Listaszerbekezds"/>
+        <w:numPr>
+          <w:ilvl w:val="0"/>
+          <w:numId w:val="20"/>
+        </w:numPr>
+      </w:pPr>
+      <w:r>
+        <w:t>a strukturált regressziós eredmények természetes nyelvi, felhasználóbarát értelmezésének előállítása nagy nyelvi modell segítségével.</w:t>
+      </w:r>
+    </w:p>
+    <w:p>
+      <w:r>
+        <w:t>Ez a megközelítés biztosítja, hogy a regressziós elemzés szervesen illeszkedjen a jelenlegi adatmodellhez és KPI-réteghez, miközben a legfontosabb modellparaméterek</w:t>
+      </w:r>
+      <w:r>
+        <w:t xml:space="preserve">, </w:t>
+      </w:r>
+      <w:r>
+        <w:t xml:space="preserve">például az </w:t>
+      </w:r>
+      <w:proofErr w:type="spellStart"/>
+      <w:r>
+        <w:t>aggregációs</w:t>
+      </w:r>
+      <w:proofErr w:type="spellEnd"/>
+      <w:r>
+        <w:t xml:space="preserve"> szint és a szűrési küszöb – rugalmasan módosíthatók maradnak.</w:t>
       </w:r>
     </w:p>
     <w:sectPr>
@@ -7426,6 +10167,269 @@
     </w:lvl>
   </w:abstractNum>
   <w:abstractNum w:abstractNumId="2" w15:restartNumberingAfterBreak="0">
+    <w:nsid w:val="12794CCB"/>
+    <w:multiLevelType w:val="multilevel"/>
+    <w:tmpl w:val="939896E2"/>
+    <w:lvl w:ilvl="0">
+      <w:start w:val="1"/>
+      <w:numFmt w:val="bullet"/>
+      <w:lvlText w:val=""/>
+      <w:lvlJc w:val="left"/>
+      <w:pPr>
+        <w:tabs>
+          <w:tab w:val="num" w:pos="720"/>
+        </w:tabs>
+        <w:ind w:left="720" w:hanging="360"/>
+      </w:pPr>
+      <w:rPr>
+        <w:rFonts w:ascii="Symbol" w:hAnsi="Symbol" w:hint="default"/>
+        <w:sz w:val="20"/>
+      </w:rPr>
+    </w:lvl>
+    <w:lvl w:ilvl="1" w:tentative="1">
+      <w:start w:val="1"/>
+      <w:numFmt w:val="bullet"/>
+      <w:lvlText w:val="o"/>
+      <w:lvlJc w:val="left"/>
+      <w:pPr>
+        <w:tabs>
+          <w:tab w:val="num" w:pos="1440"/>
+        </w:tabs>
+        <w:ind w:left="1440" w:hanging="360"/>
+      </w:pPr>
+      <w:rPr>
+        <w:rFonts w:ascii="Courier New" w:hAnsi="Courier New" w:hint="default"/>
+        <w:sz w:val="20"/>
+      </w:rPr>
+    </w:lvl>
+    <w:lvl w:ilvl="2" w:tentative="1">
+      <w:start w:val="1"/>
+      <w:numFmt w:val="bullet"/>
+      <w:lvlText w:val=""/>
+      <w:lvlJc w:val="left"/>
+      <w:pPr>
+        <w:tabs>
+          <w:tab w:val="num" w:pos="2160"/>
+        </w:tabs>
+        <w:ind w:left="2160" w:hanging="360"/>
+      </w:pPr>
+      <w:rPr>
+        <w:rFonts w:ascii="Wingdings" w:hAnsi="Wingdings" w:hint="default"/>
+        <w:sz w:val="20"/>
+      </w:rPr>
+    </w:lvl>
+    <w:lvl w:ilvl="3" w:tentative="1">
+      <w:start w:val="1"/>
+      <w:numFmt w:val="bullet"/>
+      <w:lvlText w:val=""/>
+      <w:lvlJc w:val="left"/>
+      <w:pPr>
+        <w:tabs>
+          <w:tab w:val="num" w:pos="2880"/>
+        </w:tabs>
+        <w:ind w:left="2880" w:hanging="360"/>
+      </w:pPr>
+      <w:rPr>
+        <w:rFonts w:ascii="Wingdings" w:hAnsi="Wingdings" w:hint="default"/>
+        <w:sz w:val="20"/>
+      </w:rPr>
+    </w:lvl>
+    <w:lvl w:ilvl="4" w:tentative="1">
+      <w:start w:val="1"/>
+      <w:numFmt w:val="bullet"/>
+      <w:lvlText w:val=""/>
+      <w:lvlJc w:val="left"/>
+      <w:pPr>
+        <w:tabs>
+          <w:tab w:val="num" w:pos="3600"/>
+        </w:tabs>
+        <w:ind w:left="3600" w:hanging="360"/>
+      </w:pPr>
+      <w:rPr>
+        <w:rFonts w:ascii="Wingdings" w:hAnsi="Wingdings" w:hint="default"/>
+        <w:sz w:val="20"/>
+      </w:rPr>
+    </w:lvl>
+    <w:lvl w:ilvl="5" w:tentative="1">
+      <w:start w:val="1"/>
+      <w:numFmt w:val="bullet"/>
+      <w:lvlText w:val=""/>
+      <w:lvlJc w:val="left"/>
+      <w:pPr>
+        <w:tabs>
+          <w:tab w:val="num" w:pos="4320"/>
+        </w:tabs>
+        <w:ind w:left="4320" w:hanging="360"/>
+      </w:pPr>
+      <w:rPr>
+        <w:rFonts w:ascii="Wingdings" w:hAnsi="Wingdings" w:hint="default"/>
+        <w:sz w:val="20"/>
+      </w:rPr>
+    </w:lvl>
+    <w:lvl w:ilvl="6" w:tentative="1">
+      <w:start w:val="1"/>
+      <w:numFmt w:val="bullet"/>
+      <w:lvlText w:val=""/>
+      <w:lvlJc w:val="left"/>
+      <w:pPr>
+        <w:tabs>
+          <w:tab w:val="num" w:pos="5040"/>
+        </w:tabs>
+        <w:ind w:left="5040" w:hanging="360"/>
+      </w:pPr>
+      <w:rPr>
+        <w:rFonts w:ascii="Wingdings" w:hAnsi="Wingdings" w:hint="default"/>
+        <w:sz w:val="20"/>
+      </w:rPr>
+    </w:lvl>
+    <w:lvl w:ilvl="7" w:tentative="1">
+      <w:start w:val="1"/>
+      <w:numFmt w:val="bullet"/>
+      <w:lvlText w:val=""/>
+      <w:lvlJc w:val="left"/>
+      <w:pPr>
+        <w:tabs>
+          <w:tab w:val="num" w:pos="5760"/>
+        </w:tabs>
+        <w:ind w:left="5760" w:hanging="360"/>
+      </w:pPr>
+      <w:rPr>
+        <w:rFonts w:ascii="Wingdings" w:hAnsi="Wingdings" w:hint="default"/>
+        <w:sz w:val="20"/>
+      </w:rPr>
+    </w:lvl>
+    <w:lvl w:ilvl="8" w:tentative="1">
+      <w:start w:val="1"/>
+      <w:numFmt w:val="bullet"/>
+      <w:lvlText w:val=""/>
+      <w:lvlJc w:val="left"/>
+      <w:pPr>
+        <w:tabs>
+          <w:tab w:val="num" w:pos="6480"/>
+        </w:tabs>
+        <w:ind w:left="6480" w:hanging="360"/>
+      </w:pPr>
+      <w:rPr>
+        <w:rFonts w:ascii="Wingdings" w:hAnsi="Wingdings" w:hint="default"/>
+        <w:sz w:val="20"/>
+      </w:rPr>
+    </w:lvl>
+  </w:abstractNum>
+  <w:abstractNum w:abstractNumId="3" w15:restartNumberingAfterBreak="0">
+    <w:nsid w:val="12B8487E"/>
+    <w:multiLevelType w:val="hybridMultilevel"/>
+    <w:tmpl w:val="D6C28BC4"/>
+    <w:lvl w:ilvl="0" w:tplc="52588282">
+      <w:start w:val="1"/>
+      <w:numFmt w:val="bullet"/>
+      <w:lvlText w:val=""/>
+      <w:lvlJc w:val="left"/>
+      <w:pPr>
+        <w:ind w:left="720" w:hanging="360"/>
+      </w:pPr>
+      <w:rPr>
+        <w:rFonts w:ascii="Symbol" w:hAnsi="Symbol" w:hint="default"/>
+        <w:color w:val="000000" w:themeColor="text1"/>
+      </w:rPr>
+    </w:lvl>
+    <w:lvl w:ilvl="1" w:tplc="040E0003" w:tentative="1">
+      <w:start w:val="1"/>
+      <w:numFmt w:val="bullet"/>
+      <w:lvlText w:val="o"/>
+      <w:lvlJc w:val="left"/>
+      <w:pPr>
+        <w:ind w:left="1440" w:hanging="360"/>
+      </w:pPr>
+      <w:rPr>
+        <w:rFonts w:ascii="Courier New" w:hAnsi="Courier New" w:cs="Courier New" w:hint="default"/>
+      </w:rPr>
+    </w:lvl>
+    <w:lvl w:ilvl="2" w:tplc="040E0005" w:tentative="1">
+      <w:start w:val="1"/>
+      <w:numFmt w:val="bullet"/>
+      <w:lvlText w:val=""/>
+      <w:lvlJc w:val="left"/>
+      <w:pPr>
+        <w:ind w:left="2160" w:hanging="360"/>
+      </w:pPr>
+      <w:rPr>
+        <w:rFonts w:ascii="Wingdings" w:hAnsi="Wingdings" w:hint="default"/>
+      </w:rPr>
+    </w:lvl>
+    <w:lvl w:ilvl="3" w:tplc="040E0001" w:tentative="1">
+      <w:start w:val="1"/>
+      <w:numFmt w:val="bullet"/>
+      <w:lvlText w:val=""/>
+      <w:lvlJc w:val="left"/>
+      <w:pPr>
+        <w:ind w:left="2880" w:hanging="360"/>
+      </w:pPr>
+      <w:rPr>
+        <w:rFonts w:ascii="Symbol" w:hAnsi="Symbol" w:hint="default"/>
+      </w:rPr>
+    </w:lvl>
+    <w:lvl w:ilvl="4" w:tplc="040E0003" w:tentative="1">
+      <w:start w:val="1"/>
+      <w:numFmt w:val="bullet"/>
+      <w:lvlText w:val="o"/>
+      <w:lvlJc w:val="left"/>
+      <w:pPr>
+        <w:ind w:left="3600" w:hanging="360"/>
+      </w:pPr>
+      <w:rPr>
+        <w:rFonts w:ascii="Courier New" w:hAnsi="Courier New" w:cs="Courier New" w:hint="default"/>
+      </w:rPr>
+    </w:lvl>
+    <w:lvl w:ilvl="5" w:tplc="040E0005" w:tentative="1">
+      <w:start w:val="1"/>
+      <w:numFmt w:val="bullet"/>
+      <w:lvlText w:val=""/>
+      <w:lvlJc w:val="left"/>
+      <w:pPr>
+        <w:ind w:left="4320" w:hanging="360"/>
+      </w:pPr>
+      <w:rPr>
+        <w:rFonts w:ascii="Wingdings" w:hAnsi="Wingdings" w:hint="default"/>
+      </w:rPr>
+    </w:lvl>
+    <w:lvl w:ilvl="6" w:tplc="040E0001" w:tentative="1">
+      <w:start w:val="1"/>
+      <w:numFmt w:val="bullet"/>
+      <w:lvlText w:val=""/>
+      <w:lvlJc w:val="left"/>
+      <w:pPr>
+        <w:ind w:left="5040" w:hanging="360"/>
+      </w:pPr>
+      <w:rPr>
+        <w:rFonts w:ascii="Symbol" w:hAnsi="Symbol" w:hint="default"/>
+      </w:rPr>
+    </w:lvl>
+    <w:lvl w:ilvl="7" w:tplc="040E0003" w:tentative="1">
+      <w:start w:val="1"/>
+      <w:numFmt w:val="bullet"/>
+      <w:lvlText w:val="o"/>
+      <w:lvlJc w:val="left"/>
+      <w:pPr>
+        <w:ind w:left="5760" w:hanging="360"/>
+      </w:pPr>
+      <w:rPr>
+        <w:rFonts w:ascii="Courier New" w:hAnsi="Courier New" w:cs="Courier New" w:hint="default"/>
+      </w:rPr>
+    </w:lvl>
+    <w:lvl w:ilvl="8" w:tplc="040E0005" w:tentative="1">
+      <w:start w:val="1"/>
+      <w:numFmt w:val="bullet"/>
+      <w:lvlText w:val=""/>
+      <w:lvlJc w:val="left"/>
+      <w:pPr>
+        <w:ind w:left="6480" w:hanging="360"/>
+      </w:pPr>
+      <w:rPr>
+        <w:rFonts w:ascii="Wingdings" w:hAnsi="Wingdings" w:hint="default"/>
+      </w:rPr>
+    </w:lvl>
+  </w:abstractNum>
+  <w:abstractNum w:abstractNumId="4" w15:restartNumberingAfterBreak="0">
     <w:nsid w:val="18EC3F6B"/>
     <w:multiLevelType w:val="hybridMultilevel"/>
     <w:tmpl w:val="4F9C7DEE"/>
@@ -7538,7 +10542,7 @@
       </w:rPr>
     </w:lvl>
   </w:abstractNum>
-  <w:abstractNum w:abstractNumId="3" w15:restartNumberingAfterBreak="0">
+  <w:abstractNum w:abstractNumId="5" w15:restartNumberingAfterBreak="0">
     <w:nsid w:val="25DF0529"/>
     <w:multiLevelType w:val="multilevel"/>
     <w:tmpl w:val="6FE0701E"/>
@@ -7687,7 +10691,120 @@
       </w:rPr>
     </w:lvl>
   </w:abstractNum>
-  <w:abstractNum w:abstractNumId="4" w15:restartNumberingAfterBreak="0">
+  <w:abstractNum w:abstractNumId="6" w15:restartNumberingAfterBreak="0">
+    <w:nsid w:val="273008E1"/>
+    <w:multiLevelType w:val="multilevel"/>
+    <w:tmpl w:val="BD9C9506"/>
+    <w:lvl w:ilvl="0">
+      <w:start w:val="1"/>
+      <w:numFmt w:val="decimal"/>
+      <w:lvlText w:val="%1."/>
+      <w:lvlJc w:val="left"/>
+      <w:pPr>
+        <w:tabs>
+          <w:tab w:val="num" w:pos="720"/>
+        </w:tabs>
+        <w:ind w:left="720" w:hanging="360"/>
+      </w:pPr>
+    </w:lvl>
+    <w:lvl w:ilvl="1" w:tentative="1">
+      <w:start w:val="1"/>
+      <w:numFmt w:val="decimal"/>
+      <w:lvlText w:val="%2."/>
+      <w:lvlJc w:val="left"/>
+      <w:pPr>
+        <w:tabs>
+          <w:tab w:val="num" w:pos="1440"/>
+        </w:tabs>
+        <w:ind w:left="1440" w:hanging="360"/>
+      </w:pPr>
+    </w:lvl>
+    <w:lvl w:ilvl="2" w:tentative="1">
+      <w:start w:val="1"/>
+      <w:numFmt w:val="decimal"/>
+      <w:lvlText w:val="%3."/>
+      <w:lvlJc w:val="left"/>
+      <w:pPr>
+        <w:tabs>
+          <w:tab w:val="num" w:pos="2160"/>
+        </w:tabs>
+        <w:ind w:left="2160" w:hanging="360"/>
+      </w:pPr>
+    </w:lvl>
+    <w:lvl w:ilvl="3" w:tentative="1">
+      <w:start w:val="1"/>
+      <w:numFmt w:val="decimal"/>
+      <w:lvlText w:val="%4."/>
+      <w:lvlJc w:val="left"/>
+      <w:pPr>
+        <w:tabs>
+          <w:tab w:val="num" w:pos="2880"/>
+        </w:tabs>
+        <w:ind w:left="2880" w:hanging="360"/>
+      </w:pPr>
+    </w:lvl>
+    <w:lvl w:ilvl="4" w:tentative="1">
+      <w:start w:val="1"/>
+      <w:numFmt w:val="decimal"/>
+      <w:lvlText w:val="%5."/>
+      <w:lvlJc w:val="left"/>
+      <w:pPr>
+        <w:tabs>
+          <w:tab w:val="num" w:pos="3600"/>
+        </w:tabs>
+        <w:ind w:left="3600" w:hanging="360"/>
+      </w:pPr>
+    </w:lvl>
+    <w:lvl w:ilvl="5" w:tentative="1">
+      <w:start w:val="1"/>
+      <w:numFmt w:val="decimal"/>
+      <w:lvlText w:val="%6."/>
+      <w:lvlJc w:val="left"/>
+      <w:pPr>
+        <w:tabs>
+          <w:tab w:val="num" w:pos="4320"/>
+        </w:tabs>
+        <w:ind w:left="4320" w:hanging="360"/>
+      </w:pPr>
+    </w:lvl>
+    <w:lvl w:ilvl="6" w:tentative="1">
+      <w:start w:val="1"/>
+      <w:numFmt w:val="decimal"/>
+      <w:lvlText w:val="%7."/>
+      <w:lvlJc w:val="left"/>
+      <w:pPr>
+        <w:tabs>
+          <w:tab w:val="num" w:pos="5040"/>
+        </w:tabs>
+        <w:ind w:left="5040" w:hanging="360"/>
+      </w:pPr>
+    </w:lvl>
+    <w:lvl w:ilvl="7" w:tentative="1">
+      <w:start w:val="1"/>
+      <w:numFmt w:val="decimal"/>
+      <w:lvlText w:val="%8."/>
+      <w:lvlJc w:val="left"/>
+      <w:pPr>
+        <w:tabs>
+          <w:tab w:val="num" w:pos="5760"/>
+        </w:tabs>
+        <w:ind w:left="5760" w:hanging="360"/>
+      </w:pPr>
+    </w:lvl>
+    <w:lvl w:ilvl="8" w:tentative="1">
+      <w:start w:val="1"/>
+      <w:numFmt w:val="decimal"/>
+      <w:lvlText w:val="%9."/>
+      <w:lvlJc w:val="left"/>
+      <w:pPr>
+        <w:tabs>
+          <w:tab w:val="num" w:pos="6480"/>
+        </w:tabs>
+        <w:ind w:left="6480" w:hanging="360"/>
+      </w:pPr>
+    </w:lvl>
+  </w:abstractNum>
+  <w:abstractNum w:abstractNumId="7" w15:restartNumberingAfterBreak="0">
     <w:nsid w:val="2801726F"/>
     <w:multiLevelType w:val="hybridMultilevel"/>
     <w:tmpl w:val="98743248"/>
@@ -7800,7 +10917,7 @@
       </w:rPr>
     </w:lvl>
   </w:abstractNum>
-  <w:abstractNum w:abstractNumId="5" w15:restartNumberingAfterBreak="0">
+  <w:abstractNum w:abstractNumId="8" w15:restartNumberingAfterBreak="0">
     <w:nsid w:val="2FD41092"/>
     <w:multiLevelType w:val="multilevel"/>
     <w:tmpl w:val="2A661544"/>
@@ -7950,7 +11067,7 @@
       </w:rPr>
     </w:lvl>
   </w:abstractNum>
-  <w:abstractNum w:abstractNumId="6" w15:restartNumberingAfterBreak="0">
+  <w:abstractNum w:abstractNumId="9" w15:restartNumberingAfterBreak="0">
     <w:nsid w:val="31BF1846"/>
     <w:multiLevelType w:val="multilevel"/>
     <w:tmpl w:val="E4369968"/>
@@ -8099,7 +11216,7 @@
       </w:rPr>
     </w:lvl>
   </w:abstractNum>
-  <w:abstractNum w:abstractNumId="7" w15:restartNumberingAfterBreak="0">
+  <w:abstractNum w:abstractNumId="10" w15:restartNumberingAfterBreak="0">
     <w:nsid w:val="32C02DC3"/>
     <w:multiLevelType w:val="multilevel"/>
     <w:tmpl w:val="2A661544"/>
@@ -8249,7 +11366,120 @@
       </w:rPr>
     </w:lvl>
   </w:abstractNum>
-  <w:abstractNum w:abstractNumId="8" w15:restartNumberingAfterBreak="0">
+  <w:abstractNum w:abstractNumId="11" w15:restartNumberingAfterBreak="0">
+    <w:nsid w:val="39EE0FEA"/>
+    <w:multiLevelType w:val="hybridMultilevel"/>
+    <w:tmpl w:val="579C5CD0"/>
+    <w:lvl w:ilvl="0" w:tplc="040E0001">
+      <w:start w:val="1"/>
+      <w:numFmt w:val="bullet"/>
+      <w:lvlText w:val=""/>
+      <w:lvlJc w:val="left"/>
+      <w:pPr>
+        <w:ind w:left="720" w:hanging="360"/>
+      </w:pPr>
+      <w:rPr>
+        <w:rFonts w:ascii="Symbol" w:hAnsi="Symbol" w:hint="default"/>
+      </w:rPr>
+    </w:lvl>
+    <w:lvl w:ilvl="1" w:tplc="040E0003" w:tentative="1">
+      <w:start w:val="1"/>
+      <w:numFmt w:val="bullet"/>
+      <w:lvlText w:val="o"/>
+      <w:lvlJc w:val="left"/>
+      <w:pPr>
+        <w:ind w:left="1440" w:hanging="360"/>
+      </w:pPr>
+      <w:rPr>
+        <w:rFonts w:ascii="Courier New" w:hAnsi="Courier New" w:cs="Courier New" w:hint="default"/>
+      </w:rPr>
+    </w:lvl>
+    <w:lvl w:ilvl="2" w:tplc="040E0005" w:tentative="1">
+      <w:start w:val="1"/>
+      <w:numFmt w:val="bullet"/>
+      <w:lvlText w:val=""/>
+      <w:lvlJc w:val="left"/>
+      <w:pPr>
+        <w:ind w:left="2160" w:hanging="360"/>
+      </w:pPr>
+      <w:rPr>
+        <w:rFonts w:ascii="Wingdings" w:hAnsi="Wingdings" w:hint="default"/>
+      </w:rPr>
+    </w:lvl>
+    <w:lvl w:ilvl="3" w:tplc="040E0001" w:tentative="1">
+      <w:start w:val="1"/>
+      <w:numFmt w:val="bullet"/>
+      <w:lvlText w:val=""/>
+      <w:lvlJc w:val="left"/>
+      <w:pPr>
+        <w:ind w:left="2880" w:hanging="360"/>
+      </w:pPr>
+      <w:rPr>
+        <w:rFonts w:ascii="Symbol" w:hAnsi="Symbol" w:hint="default"/>
+      </w:rPr>
+    </w:lvl>
+    <w:lvl w:ilvl="4" w:tplc="040E0003" w:tentative="1">
+      <w:start w:val="1"/>
+      <w:numFmt w:val="bullet"/>
+      <w:lvlText w:val="o"/>
+      <w:lvlJc w:val="left"/>
+      <w:pPr>
+        <w:ind w:left="3600" w:hanging="360"/>
+      </w:pPr>
+      <w:rPr>
+        <w:rFonts w:ascii="Courier New" w:hAnsi="Courier New" w:cs="Courier New" w:hint="default"/>
+      </w:rPr>
+    </w:lvl>
+    <w:lvl w:ilvl="5" w:tplc="040E0005" w:tentative="1">
+      <w:start w:val="1"/>
+      <w:numFmt w:val="bullet"/>
+      <w:lvlText w:val=""/>
+      <w:lvlJc w:val="left"/>
+      <w:pPr>
+        <w:ind w:left="4320" w:hanging="360"/>
+      </w:pPr>
+      <w:rPr>
+        <w:rFonts w:ascii="Wingdings" w:hAnsi="Wingdings" w:hint="default"/>
+      </w:rPr>
+    </w:lvl>
+    <w:lvl w:ilvl="6" w:tplc="040E0001" w:tentative="1">
+      <w:start w:val="1"/>
+      <w:numFmt w:val="bullet"/>
+      <w:lvlText w:val=""/>
+      <w:lvlJc w:val="left"/>
+      <w:pPr>
+        <w:ind w:left="5040" w:hanging="360"/>
+      </w:pPr>
+      <w:rPr>
+        <w:rFonts w:ascii="Symbol" w:hAnsi="Symbol" w:hint="default"/>
+      </w:rPr>
+    </w:lvl>
+    <w:lvl w:ilvl="7" w:tplc="040E0003" w:tentative="1">
+      <w:start w:val="1"/>
+      <w:numFmt w:val="bullet"/>
+      <w:lvlText w:val="o"/>
+      <w:lvlJc w:val="left"/>
+      <w:pPr>
+        <w:ind w:left="5760" w:hanging="360"/>
+      </w:pPr>
+      <w:rPr>
+        <w:rFonts w:ascii="Courier New" w:hAnsi="Courier New" w:cs="Courier New" w:hint="default"/>
+      </w:rPr>
+    </w:lvl>
+    <w:lvl w:ilvl="8" w:tplc="040E0005" w:tentative="1">
+      <w:start w:val="1"/>
+      <w:numFmt w:val="bullet"/>
+      <w:lvlText w:val=""/>
+      <w:lvlJc w:val="left"/>
+      <w:pPr>
+        <w:ind w:left="6480" w:hanging="360"/>
+      </w:pPr>
+      <w:rPr>
+        <w:rFonts w:ascii="Wingdings" w:hAnsi="Wingdings" w:hint="default"/>
+      </w:rPr>
+    </w:lvl>
+  </w:abstractNum>
+  <w:abstractNum w:abstractNumId="12" w15:restartNumberingAfterBreak="0">
     <w:nsid w:val="44496E60"/>
     <w:multiLevelType w:val="multilevel"/>
     <w:tmpl w:val="3EEC2F2E"/>
@@ -8398,7 +11628,93 @@
       </w:rPr>
     </w:lvl>
   </w:abstractNum>
-  <w:abstractNum w:abstractNumId="9" w15:restartNumberingAfterBreak="0">
+  <w:abstractNum w:abstractNumId="13" w15:restartNumberingAfterBreak="0">
+    <w:nsid w:val="47D85B2B"/>
+    <w:multiLevelType w:val="hybridMultilevel"/>
+    <w:tmpl w:val="856AC2A6"/>
+    <w:lvl w:ilvl="0" w:tplc="040E000F">
+      <w:start w:val="1"/>
+      <w:numFmt w:val="decimal"/>
+      <w:lvlText w:val="%1."/>
+      <w:lvlJc w:val="left"/>
+      <w:pPr>
+        <w:ind w:left="720" w:hanging="360"/>
+      </w:pPr>
+    </w:lvl>
+    <w:lvl w:ilvl="1" w:tplc="040E0019" w:tentative="1">
+      <w:start w:val="1"/>
+      <w:numFmt w:val="lowerLetter"/>
+      <w:lvlText w:val="%2."/>
+      <w:lvlJc w:val="left"/>
+      <w:pPr>
+        <w:ind w:left="1440" w:hanging="360"/>
+      </w:pPr>
+    </w:lvl>
+    <w:lvl w:ilvl="2" w:tplc="040E001B" w:tentative="1">
+      <w:start w:val="1"/>
+      <w:numFmt w:val="lowerRoman"/>
+      <w:lvlText w:val="%3."/>
+      <w:lvlJc w:val="right"/>
+      <w:pPr>
+        <w:ind w:left="2160" w:hanging="180"/>
+      </w:pPr>
+    </w:lvl>
+    <w:lvl w:ilvl="3" w:tplc="040E000F" w:tentative="1">
+      <w:start w:val="1"/>
+      <w:numFmt w:val="decimal"/>
+      <w:lvlText w:val="%4."/>
+      <w:lvlJc w:val="left"/>
+      <w:pPr>
+        <w:ind w:left="2880" w:hanging="360"/>
+      </w:pPr>
+    </w:lvl>
+    <w:lvl w:ilvl="4" w:tplc="040E0019" w:tentative="1">
+      <w:start w:val="1"/>
+      <w:numFmt w:val="lowerLetter"/>
+      <w:lvlText w:val="%5."/>
+      <w:lvlJc w:val="left"/>
+      <w:pPr>
+        <w:ind w:left="3600" w:hanging="360"/>
+      </w:pPr>
+    </w:lvl>
+    <w:lvl w:ilvl="5" w:tplc="040E001B" w:tentative="1">
+      <w:start w:val="1"/>
+      <w:numFmt w:val="lowerRoman"/>
+      <w:lvlText w:val="%6."/>
+      <w:lvlJc w:val="right"/>
+      <w:pPr>
+        <w:ind w:left="4320" w:hanging="180"/>
+      </w:pPr>
+    </w:lvl>
+    <w:lvl w:ilvl="6" w:tplc="040E000F" w:tentative="1">
+      <w:start w:val="1"/>
+      <w:numFmt w:val="decimal"/>
+      <w:lvlText w:val="%7."/>
+      <w:lvlJc w:val="left"/>
+      <w:pPr>
+        <w:ind w:left="5040" w:hanging="360"/>
+      </w:pPr>
+    </w:lvl>
+    <w:lvl w:ilvl="7" w:tplc="040E0019" w:tentative="1">
+      <w:start w:val="1"/>
+      <w:numFmt w:val="lowerLetter"/>
+      <w:lvlText w:val="%8."/>
+      <w:lvlJc w:val="left"/>
+      <w:pPr>
+        <w:ind w:left="5760" w:hanging="360"/>
+      </w:pPr>
+    </w:lvl>
+    <w:lvl w:ilvl="8" w:tplc="040E001B" w:tentative="1">
+      <w:start w:val="1"/>
+      <w:numFmt w:val="lowerRoman"/>
+      <w:lvlText w:val="%9."/>
+      <w:lvlJc w:val="right"/>
+      <w:pPr>
+        <w:ind w:left="6480" w:hanging="180"/>
+      </w:pPr>
+    </w:lvl>
+  </w:abstractNum>
+  <w:abstractNum w:abstractNumId="14" w15:restartNumberingAfterBreak="0">
     <w:nsid w:val="5E6E69C0"/>
     <w:multiLevelType w:val="hybridMultilevel"/>
     <w:tmpl w:val="A9DCD3FE"/>
@@ -8511,7 +11827,93 @@
       </w:rPr>
     </w:lvl>
   </w:abstractNum>
-  <w:abstractNum w:abstractNumId="10" w15:restartNumberingAfterBreak="0">
+  <w:abstractNum w:abstractNumId="15" w15:restartNumberingAfterBreak="0">
+    <w:nsid w:val="649D1D50"/>
+    <w:multiLevelType w:val="hybridMultilevel"/>
+    <w:tmpl w:val="9CF2694C"/>
+    <w:lvl w:ilvl="0" w:tplc="040E000F">
+      <w:start w:val="1"/>
+      <w:numFmt w:val="decimal"/>
+      <w:lvlText w:val="%1."/>
+      <w:lvlJc w:val="left"/>
+      <w:pPr>
+        <w:ind w:left="720" w:hanging="360"/>
+      </w:pPr>
+    </w:lvl>
+    <w:lvl w:ilvl="1" w:tplc="040E0019" w:tentative="1">
+      <w:start w:val="1"/>
+      <w:numFmt w:val="lowerLetter"/>
+      <w:lvlText w:val="%2."/>
+      <w:lvlJc w:val="left"/>
+      <w:pPr>
+        <w:ind w:left="1440" w:hanging="360"/>
+      </w:pPr>
+    </w:lvl>
+    <w:lvl w:ilvl="2" w:tplc="040E001B" w:tentative="1">
+      <w:start w:val="1"/>
+      <w:numFmt w:val="lowerRoman"/>
+      <w:lvlText w:val="%3."/>
+      <w:lvlJc w:val="right"/>
+      <w:pPr>
+        <w:ind w:left="2160" w:hanging="180"/>
+      </w:pPr>
+    </w:lvl>
+    <w:lvl w:ilvl="3" w:tplc="040E000F" w:tentative="1">
+      <w:start w:val="1"/>
+      <w:numFmt w:val="decimal"/>
+      <w:lvlText w:val="%4."/>
+      <w:lvlJc w:val="left"/>
+      <w:pPr>
+        <w:ind w:left="2880" w:hanging="360"/>
+      </w:pPr>
+    </w:lvl>
+    <w:lvl w:ilvl="4" w:tplc="040E0019" w:tentative="1">
+      <w:start w:val="1"/>
+      <w:numFmt w:val="lowerLetter"/>
+      <w:lvlText w:val="%5."/>
+      <w:lvlJc w:val="left"/>
+      <w:pPr>
+        <w:ind w:left="3600" w:hanging="360"/>
+      </w:pPr>
+    </w:lvl>
+    <w:lvl w:ilvl="5" w:tplc="040E001B" w:tentative="1">
+      <w:start w:val="1"/>
+      <w:numFmt w:val="lowerRoman"/>
+      <w:lvlText w:val="%6."/>
+      <w:lvlJc w:val="right"/>
+      <w:pPr>
+        <w:ind w:left="4320" w:hanging="180"/>
+      </w:pPr>
+    </w:lvl>
+    <w:lvl w:ilvl="6" w:tplc="040E000F" w:tentative="1">
+      <w:start w:val="1"/>
+      <w:numFmt w:val="decimal"/>
+      <w:lvlText w:val="%7."/>
+      <w:lvlJc w:val="left"/>
+      <w:pPr>
+        <w:ind w:left="5040" w:hanging="360"/>
+      </w:pPr>
+    </w:lvl>
+    <w:lvl w:ilvl="7" w:tplc="040E0019" w:tentative="1">
+      <w:start w:val="1"/>
+      <w:numFmt w:val="lowerLetter"/>
+      <w:lvlText w:val="%8."/>
+      <w:lvlJc w:val="left"/>
+      <w:pPr>
+        <w:ind w:left="5760" w:hanging="360"/>
+      </w:pPr>
+    </w:lvl>
+    <w:lvl w:ilvl="8" w:tplc="040E001B" w:tentative="1">
+      <w:start w:val="1"/>
+      <w:numFmt w:val="lowerRoman"/>
+      <w:lvlText w:val="%9."/>
+      <w:lvlJc w:val="right"/>
+      <w:pPr>
+        <w:ind w:left="6480" w:hanging="180"/>
+      </w:pPr>
+    </w:lvl>
+  </w:abstractNum>
+  <w:abstractNum w:abstractNumId="16" w15:restartNumberingAfterBreak="0">
     <w:nsid w:val="7214447F"/>
     <w:multiLevelType w:val="hybridMultilevel"/>
     <w:tmpl w:val="A6DE173A"/>
@@ -8625,7 +12027,120 @@
       </w:rPr>
     </w:lvl>
   </w:abstractNum>
-  <w:abstractNum w:abstractNumId="11" w15:restartNumberingAfterBreak="0">
+  <w:abstractNum w:abstractNumId="17" w15:restartNumberingAfterBreak="0">
+    <w:nsid w:val="775960C4"/>
+    <w:multiLevelType w:val="hybridMultilevel"/>
+    <w:tmpl w:val="F33E2F8C"/>
+    <w:lvl w:ilvl="0" w:tplc="040E0001">
+      <w:start w:val="1"/>
+      <w:numFmt w:val="bullet"/>
+      <w:lvlText w:val=""/>
+      <w:lvlJc w:val="left"/>
+      <w:pPr>
+        <w:ind w:left="720" w:hanging="360"/>
+      </w:pPr>
+      <w:rPr>
+        <w:rFonts w:ascii="Symbol" w:hAnsi="Symbol" w:hint="default"/>
+      </w:rPr>
+    </w:lvl>
+    <w:lvl w:ilvl="1" w:tplc="040E0003" w:tentative="1">
+      <w:start w:val="1"/>
+      <w:numFmt w:val="bullet"/>
+      <w:lvlText w:val="o"/>
+      <w:lvlJc w:val="left"/>
+      <w:pPr>
+        <w:ind w:left="1440" w:hanging="360"/>
+      </w:pPr>
+      <w:rPr>
+        <w:rFonts w:ascii="Courier New" w:hAnsi="Courier New" w:cs="Courier New" w:hint="default"/>
+      </w:rPr>
+    </w:lvl>
+    <w:lvl w:ilvl="2" w:tplc="040E0005" w:tentative="1">
+      <w:start w:val="1"/>
+      <w:numFmt w:val="bullet"/>
+      <w:lvlText w:val=""/>
+      <w:lvlJc w:val="left"/>
+      <w:pPr>
+        <w:ind w:left="2160" w:hanging="360"/>
+      </w:pPr>
+      <w:rPr>
+        <w:rFonts w:ascii="Wingdings" w:hAnsi="Wingdings" w:hint="default"/>
+      </w:rPr>
+    </w:lvl>
+    <w:lvl w:ilvl="3" w:tplc="040E0001" w:tentative="1">
+      <w:start w:val="1"/>
+      <w:numFmt w:val="bullet"/>
+      <w:lvlText w:val=""/>
+      <w:lvlJc w:val="left"/>
+      <w:pPr>
+        <w:ind w:left="2880" w:hanging="360"/>
+      </w:pPr>
+      <w:rPr>
+        <w:rFonts w:ascii="Symbol" w:hAnsi="Symbol" w:hint="default"/>
+      </w:rPr>
+    </w:lvl>
+    <w:lvl w:ilvl="4" w:tplc="040E0003" w:tentative="1">
+      <w:start w:val="1"/>
+      <w:numFmt w:val="bullet"/>
+      <w:lvlText w:val="o"/>
+      <w:lvlJc w:val="left"/>
+      <w:pPr>
+        <w:ind w:left="3600" w:hanging="360"/>
+      </w:pPr>
+      <w:rPr>
+        <w:rFonts w:ascii="Courier New" w:hAnsi="Courier New" w:cs="Courier New" w:hint="default"/>
+      </w:rPr>
+    </w:lvl>
+    <w:lvl w:ilvl="5" w:tplc="040E0005" w:tentative="1">
+      <w:start w:val="1"/>
+      <w:numFmt w:val="bullet"/>
+      <w:lvlText w:val=""/>
+      <w:lvlJc w:val="left"/>
+      <w:pPr>
+        <w:ind w:left="4320" w:hanging="360"/>
+      </w:pPr>
+      <w:rPr>
+        <w:rFonts w:ascii="Wingdings" w:hAnsi="Wingdings" w:hint="default"/>
+      </w:rPr>
+    </w:lvl>
+    <w:lvl w:ilvl="6" w:tplc="040E0001" w:tentative="1">
+      <w:start w:val="1"/>
+      <w:numFmt w:val="bullet"/>
+      <w:lvlText w:val=""/>
+      <w:lvlJc w:val="left"/>
+      <w:pPr>
+        <w:ind w:left="5040" w:hanging="360"/>
+      </w:pPr>
+      <w:rPr>
+        <w:rFonts w:ascii="Symbol" w:hAnsi="Symbol" w:hint="default"/>
+      </w:rPr>
+    </w:lvl>
+    <w:lvl w:ilvl="7" w:tplc="040E0003" w:tentative="1">
+      <w:start w:val="1"/>
+      <w:numFmt w:val="bullet"/>
+      <w:lvlText w:val="o"/>
+      <w:lvlJc w:val="left"/>
+      <w:pPr>
+        <w:ind w:left="5760" w:hanging="360"/>
+      </w:pPr>
+      <w:rPr>
+        <w:rFonts w:ascii="Courier New" w:hAnsi="Courier New" w:cs="Courier New" w:hint="default"/>
+      </w:rPr>
+    </w:lvl>
+    <w:lvl w:ilvl="8" w:tplc="040E0005" w:tentative="1">
+      <w:start w:val="1"/>
+      <w:numFmt w:val="bullet"/>
+      <w:lvlText w:val=""/>
+      <w:lvlJc w:val="left"/>
+      <w:pPr>
+        <w:ind w:left="6480" w:hanging="360"/>
+      </w:pPr>
+      <w:rPr>
+        <w:rFonts w:ascii="Wingdings" w:hAnsi="Wingdings" w:hint="default"/>
+      </w:rPr>
+    </w:lvl>
+  </w:abstractNum>
+  <w:abstractNum w:abstractNumId="18" w15:restartNumberingAfterBreak="0">
     <w:nsid w:val="782C7DEA"/>
     <w:multiLevelType w:val="multilevel"/>
     <w:tmpl w:val="767E2088"/>
@@ -8774,7 +12289,7 @@
       </w:rPr>
     </w:lvl>
   </w:abstractNum>
-  <w:abstractNum w:abstractNumId="12" w15:restartNumberingAfterBreak="0">
+  <w:abstractNum w:abstractNumId="19" w15:restartNumberingAfterBreak="0">
     <w:nsid w:val="79091134"/>
     <w:multiLevelType w:val="multilevel"/>
     <w:tmpl w:val="4A0E886E"/>
@@ -8923,7 +12438,7 @@
       </w:rPr>
     </w:lvl>
   </w:abstractNum>
-  <w:abstractNum w:abstractNumId="13" w15:restartNumberingAfterBreak="0">
+  <w:abstractNum w:abstractNumId="20" w15:restartNumberingAfterBreak="0">
     <w:nsid w:val="794C2FE3"/>
     <w:multiLevelType w:val="multilevel"/>
     <w:tmpl w:val="2A661544"/>
@@ -9074,46 +12589,67 @@
     </w:lvl>
   </w:abstractNum>
   <w:num w:numId="1">
-    <w:abstractNumId w:val="9"/>
+    <w:abstractNumId w:val="14"/>
   </w:num>
   <w:num w:numId="2">
-    <w:abstractNumId w:val="2"/>
+    <w:abstractNumId w:val="4"/>
   </w:num>
   <w:num w:numId="3">
     <w:abstractNumId w:val="1"/>
   </w:num>
   <w:num w:numId="4">
-    <w:abstractNumId w:val="10"/>
+    <w:abstractNumId w:val="16"/>
   </w:num>
   <w:num w:numId="5">
-    <w:abstractNumId w:val="11"/>
+    <w:abstractNumId w:val="18"/>
   </w:num>
   <w:num w:numId="6">
-    <w:abstractNumId w:val="6"/>
+    <w:abstractNumId w:val="9"/>
   </w:num>
   <w:num w:numId="7">
-    <w:abstractNumId w:val="12"/>
+    <w:abstractNumId w:val="19"/>
   </w:num>
   <w:num w:numId="8">
-    <w:abstractNumId w:val="3"/>
+    <w:abstractNumId w:val="5"/>
   </w:num>
   <w:num w:numId="9">
-    <w:abstractNumId w:val="8"/>
+    <w:abstractNumId w:val="12"/>
   </w:num>
   <w:num w:numId="10">
     <w:abstractNumId w:val="0"/>
   </w:num>
   <w:num w:numId="11">
+    <w:abstractNumId w:val="20"/>
+  </w:num>
+  <w:num w:numId="12">
+    <w:abstractNumId w:val="10"/>
+  </w:num>
+  <w:num w:numId="13">
+    <w:abstractNumId w:val="8"/>
+  </w:num>
+  <w:num w:numId="14">
+    <w:abstractNumId w:val="7"/>
+  </w:num>
+  <w:num w:numId="15">
+    <w:abstractNumId w:val="17"/>
+  </w:num>
+  <w:num w:numId="16">
+    <w:abstractNumId w:val="3"/>
+  </w:num>
+  <w:num w:numId="17">
+    <w:abstractNumId w:val="2"/>
+  </w:num>
+  <w:num w:numId="18">
+    <w:abstractNumId w:val="6"/>
+  </w:num>
+  <w:num w:numId="19">
     <w:abstractNumId w:val="13"/>
   </w:num>
-  <w:num w:numId="12">
-    <w:abstractNumId w:val="7"/>
+  <w:num w:numId="20">
+    <w:abstractNumId w:val="15"/>
   </w:num>
-  <w:num w:numId="13">
-    <w:abstractNumId w:val="5"/>
-  </w:num>
-  <w:num w:numId="14">
-    <w:abstractNumId w:val="4"/>
+  <w:num w:numId="21">
+    <w:abstractNumId w:val="11"/>
   </w:num>
 </w:numbering>
 </file>
@@ -9516,6 +13052,7 @@
   <w:style w:type="paragraph" w:default="1" w:styleId="Norml">
     <w:name w:val="Normal"/>
     <w:qFormat/>
+    <w:rsid w:val="0082102F"/>
   </w:style>
   <w:style w:type="character" w:default="1" w:styleId="Bekezdsalapbettpusa">
     <w:name w:val="Default Paragraph Font"/>
@@ -9668,6 +13205,11 @@
       <w:sz w:val="20"/>
       <w:szCs w:val="20"/>
     </w:rPr>
+  </w:style>
+  <w:style w:type="character" w:customStyle="1" w:styleId="mord">
+    <w:name w:val="mord"/>
+    <w:basedOn w:val="Bekezdsalapbettpusa"/>
+    <w:rsid w:val="00911F07"/>
   </w:style>
 </w:styles>
 </file>

</xml_diff>